<commit_message>
Actualizar Capítulo 3 - Ingeniería de requisitos
</commit_message>
<xml_diff>
--- a/FASE 1 - ANALISIS/CAPITULO 3 - INGENIERIA DE REQUISITOS/Capitulo 3 - Ingenieria de requisitos.docx
+++ b/FASE 1 - ANALISIS/CAPITULO 3 - INGENIERIA DE REQUISITOS/Capitulo 3 - Ingenieria de requisitos.docx
@@ -585,7 +585,13 @@
         <w:t>YENJO 1.0</w:t>
       </w:r>
       <w:r>
-        <w:t xml:space="preserve"> para consultar los servicios disponibles, revisar la información de los profesionales, gestionar su disponibilidad y realizar procesos relacionados con la solicitud y seguimiento de citas.</w:t>
+        <w:t xml:space="preserve"> para consultar los servicios disponibles, revisar la información de los profesionales, </w:t>
+      </w:r>
+      <w:r>
+        <w:t xml:space="preserve">consultar la disponibilidad de los profesionales </w:t>
+      </w:r>
+      <w:r>
+        <w:t>y realizar procesos relacionados con la solicitud y seguimiento de citas.</w:t>
       </w:r>
     </w:p>
     <w:p>
@@ -2363,16 +2369,22 @@
         <w:t>Actor:</w:t>
       </w:r>
       <w:r>
-        <w:t xml:space="preserve"> Cliente / Estilista / Administrador</w:t>
-      </w:r>
-    </w:p>
-    <w:p>
-      <w:pPr>
-        <w:spacing w:after="0"/>
-        <w:jc w:val="both"/>
-      </w:pPr>
-      <w:r>
-        <w:t>El sistema debe permitir gestionar el estado de las citas de acuerdo con las acciones y permisos establecidos para cada actor.</w:t>
+        <w:t xml:space="preserve"> Administrador</w:t>
+      </w:r>
+    </w:p>
+    <w:p>
+      <w:pPr>
+        <w:spacing w:after="0"/>
+        <w:jc w:val="both"/>
+      </w:pPr>
+      <w:r>
+        <w:t xml:space="preserve">El sistema debe permitir gestionar el estado de las citas de acuerdo con las acciones y permisos establecidos para </w:t>
+      </w:r>
+      <w:r>
+        <w:t>este Rol</w:t>
+      </w:r>
+      <w:r>
+        <w:t>.</w:t>
       </w:r>
     </w:p>
     <w:p>
@@ -2428,16 +2440,22 @@
         <w:t>Actor:</w:t>
       </w:r>
       <w:r>
-        <w:t xml:space="preserve"> Cliente / Administrador</w:t>
-      </w:r>
-    </w:p>
-    <w:p>
-      <w:pPr>
-        <w:spacing w:after="0"/>
-        <w:jc w:val="both"/>
-      </w:pPr>
-      <w:r>
-        <w:t>El sistema debe permitir gestionar y consultar la información relacionada con los pagos asociados a los servicios y citas, de acuerdo con las funcionalidades y permisos definidos para cada actor.</w:t>
+        <w:t xml:space="preserve"> Cliente</w:t>
+      </w:r>
+    </w:p>
+    <w:p>
+      <w:pPr>
+        <w:spacing w:after="0"/>
+        <w:jc w:val="both"/>
+      </w:pPr>
+      <w:r>
+        <w:t>El sistema debe permitir</w:t>
+      </w:r>
+      <w:r>
+        <w:t xml:space="preserve"> al cliente</w:t>
+      </w:r>
+      <w:r>
+        <w:t xml:space="preserve"> consultar la información relacionada con los pagos asociados a los servicios y citas, de acuerdo con las funcionalidades y permisos definidos para cada actor.</w:t>
       </w:r>
     </w:p>
     <w:p>
@@ -2561,56 +2579,71 @@
       <w:pPr>
         <w:spacing w:after="0"/>
         <w:jc w:val="both"/>
-      </w:pPr>
-    </w:p>
-    <w:p>
-      <w:pPr>
-        <w:spacing w:after="0"/>
-        <w:jc w:val="both"/>
-      </w:pPr>
-    </w:p>
-    <w:p>
-      <w:pPr>
-        <w:spacing w:after="0"/>
-        <w:jc w:val="both"/>
-        <w:rPr>
-          <w:b/>
-          <w:bCs/>
-        </w:rPr>
-      </w:pPr>
-      <w:r>
-        <w:rPr>
-          <w:rFonts w:ascii="Arial Black" w:hAnsi="Arial Black"/>
-          <w:sz w:val="20"/>
-          <w:szCs w:val="20"/>
-        </w:rPr>
+        <w:rPr>
+          <w:b/>
+          <w:bCs/>
+        </w:rPr>
+      </w:pPr>
+      <w:r>
+        <w:rPr>
+          <w:b/>
+          <w:bCs/>
+        </w:rPr>
+        <w:t>RF-017 — Gestión de servicios profesionales</w:t>
+      </w:r>
+    </w:p>
+    <w:p>
+      <w:pPr>
+        <w:spacing w:after="0"/>
+        <w:jc w:val="both"/>
+      </w:pPr>
+      <w:r>
+        <w:rPr>
+          <w:b/>
+          <w:bCs/>
+        </w:rPr>
+        <w:t>Actor</w:t>
+      </w:r>
+      <w:r>
+        <w:t>: Estilista</w:t>
+      </w:r>
+    </w:p>
+    <w:p>
+      <w:pPr>
+        <w:spacing w:after="0"/>
+        <w:jc w:val="both"/>
+      </w:pPr>
+      <w:r>
         <w:lastRenderedPageBreak/>
-        <w:t>Tabla 3.1 Resumen RF</w:t>
-      </w:r>
-    </w:p>
-    <w:p>
-      <w:pPr>
-        <w:spacing w:after="0"/>
-        <w:jc w:val="both"/>
-        <w:rPr>
-          <w:b/>
-          <w:bCs/>
-        </w:rPr>
-      </w:pPr>
-      <w:r>
-        <w:rPr>
-          <w:noProof/>
-        </w:rPr>
+        <w:t>El sistema debe permitir al Estilista gestionar la información de los servicios que ofrece, de acuerdo con los permisos establecidos.</w:t>
+      </w:r>
+    </w:p>
+    <w:p>
+      <w:pPr>
+        <w:spacing w:after="0"/>
+        <w:jc w:val="both"/>
+      </w:pPr>
+    </w:p>
+    <w:p>
+      <w:pPr>
+        <w:spacing w:after="0"/>
+        <w:jc w:val="both"/>
+        <w:rPr>
+          <w:b/>
+          <w:bCs/>
+        </w:rPr>
+      </w:pPr>
+      <w:r>
         <w:drawing>
-          <wp:anchor distT="0" distB="0" distL="114300" distR="114300" simplePos="0" relativeHeight="251658240" behindDoc="1" locked="0" layoutInCell="1" allowOverlap="1" wp14:anchorId="64DB1673" wp14:editId="76AC7A00">
+          <wp:anchor distT="0" distB="0" distL="114300" distR="114300" simplePos="0" relativeHeight="251672576" behindDoc="1" locked="0" layoutInCell="1" allowOverlap="1" wp14:anchorId="2B29E804" wp14:editId="3992D43A">
             <wp:simplePos x="0" y="0"/>
             <wp:positionH relativeFrom="column">
               <wp:posOffset>-3810</wp:posOffset>
             </wp:positionH>
             <wp:positionV relativeFrom="paragraph">
-              <wp:posOffset>-1270</wp:posOffset>
+              <wp:posOffset>196215</wp:posOffset>
             </wp:positionV>
-            <wp:extent cx="5581650" cy="3438525"/>
+            <wp:extent cx="5619750" cy="3476625"/>
             <wp:effectExtent l="0" t="0" r="0" b="9525"/>
             <wp:wrapNone/>
             <wp:docPr id="1" name="Imagen 1"/>
@@ -2621,7 +2654,7 @@
               <a:graphicData uri="http://schemas.openxmlformats.org/drawingml/2006/picture">
                 <pic:pic xmlns:pic="http://schemas.openxmlformats.org/drawingml/2006/picture">
                   <pic:nvPicPr>
-                    <pic:cNvPr id="0" name="Picture 1"/>
+                    <pic:cNvPr id="0" name="Picture 2"/>
                     <pic:cNvPicPr>
                       <a:picLocks noChangeAspect="1" noChangeArrowheads="1"/>
                     </pic:cNvPicPr>
@@ -2642,7 +2675,7 @@
                   <pic:spPr bwMode="auto">
                     <a:xfrm>
                       <a:off x="0" y="0"/>
-                      <a:ext cx="5581650" cy="3438525"/>
+                      <a:ext cx="5619750" cy="3476625"/>
                     </a:xfrm>
                     <a:prstGeom prst="rect">
                       <a:avLst/>
@@ -2655,867 +2688,853 @@
                 </pic:pic>
               </a:graphicData>
             </a:graphic>
+            <wp14:sizeRelH relativeFrom="margin">
+              <wp14:pctWidth>0</wp14:pctWidth>
+            </wp14:sizeRelH>
+            <wp14:sizeRelV relativeFrom="margin">
+              <wp14:pctHeight>0</wp14:pctHeight>
+            </wp14:sizeRelV>
           </wp:anchor>
         </w:drawing>
       </w:r>
-    </w:p>
-    <w:p>
-      <w:pPr>
-        <w:spacing w:after="0"/>
-        <w:jc w:val="both"/>
-        <w:rPr>
-          <w:b/>
-          <w:bCs/>
-        </w:rPr>
-      </w:pPr>
-    </w:p>
-    <w:p>
-      <w:pPr>
-        <w:spacing w:after="0"/>
-        <w:jc w:val="both"/>
-        <w:rPr>
-          <w:b/>
-          <w:bCs/>
-        </w:rPr>
-      </w:pPr>
-    </w:p>
-    <w:p>
-      <w:pPr>
-        <w:spacing w:after="0"/>
-        <w:jc w:val="both"/>
-        <w:rPr>
-          <w:b/>
-          <w:bCs/>
-        </w:rPr>
-      </w:pPr>
-    </w:p>
-    <w:p>
-      <w:pPr>
-        <w:spacing w:after="0"/>
-        <w:jc w:val="both"/>
-        <w:rPr>
-          <w:b/>
-          <w:bCs/>
-        </w:rPr>
-      </w:pPr>
-    </w:p>
-    <w:p>
-      <w:pPr>
-        <w:spacing w:after="0"/>
-        <w:jc w:val="both"/>
-        <w:rPr>
-          <w:b/>
-          <w:bCs/>
-        </w:rPr>
-      </w:pPr>
-    </w:p>
-    <w:p>
-      <w:pPr>
-        <w:spacing w:after="0"/>
-        <w:jc w:val="both"/>
-        <w:rPr>
-          <w:b/>
-          <w:bCs/>
-        </w:rPr>
-      </w:pPr>
-    </w:p>
-    <w:p>
-      <w:pPr>
-        <w:spacing w:after="0"/>
-        <w:jc w:val="both"/>
-        <w:rPr>
-          <w:b/>
-          <w:bCs/>
-        </w:rPr>
-      </w:pPr>
-    </w:p>
-    <w:p>
-      <w:pPr>
-        <w:spacing w:after="0"/>
-        <w:jc w:val="both"/>
-        <w:rPr>
-          <w:b/>
-          <w:bCs/>
-        </w:rPr>
-      </w:pPr>
-    </w:p>
-    <w:p>
-      <w:pPr>
-        <w:spacing w:after="0"/>
-        <w:jc w:val="both"/>
-        <w:rPr>
-          <w:b/>
-          <w:bCs/>
-        </w:rPr>
-      </w:pPr>
-    </w:p>
-    <w:p>
-      <w:pPr>
-        <w:spacing w:after="0"/>
-        <w:jc w:val="both"/>
-        <w:rPr>
-          <w:b/>
-          <w:bCs/>
-        </w:rPr>
-      </w:pPr>
-    </w:p>
-    <w:p>
-      <w:pPr>
-        <w:spacing w:after="0"/>
-        <w:jc w:val="both"/>
-        <w:rPr>
-          <w:b/>
-          <w:bCs/>
-        </w:rPr>
-      </w:pPr>
-    </w:p>
-    <w:p>
-      <w:pPr>
-        <w:spacing w:after="0"/>
-        <w:jc w:val="both"/>
-        <w:rPr>
-          <w:b/>
-          <w:bCs/>
-        </w:rPr>
-      </w:pPr>
-    </w:p>
-    <w:p>
-      <w:pPr>
-        <w:spacing w:after="0"/>
-        <w:jc w:val="both"/>
-        <w:rPr>
-          <w:b/>
-          <w:bCs/>
-        </w:rPr>
-      </w:pPr>
-    </w:p>
-    <w:p>
-      <w:pPr>
-        <w:spacing w:after="0"/>
-        <w:jc w:val="both"/>
-        <w:rPr>
-          <w:b/>
-          <w:bCs/>
-        </w:rPr>
-      </w:pPr>
-    </w:p>
-    <w:p>
-      <w:pPr>
-        <w:spacing w:after="0"/>
-        <w:jc w:val="both"/>
-        <w:rPr>
-          <w:b/>
-          <w:bCs/>
-        </w:rPr>
-      </w:pPr>
-    </w:p>
-    <w:p>
-      <w:pPr>
-        <w:spacing w:after="0"/>
-        <w:jc w:val="both"/>
-        <w:rPr>
-          <w:b/>
-          <w:bCs/>
-        </w:rPr>
-      </w:pPr>
-    </w:p>
-    <w:p>
-      <w:pPr>
-        <w:spacing w:after="0"/>
-        <w:jc w:val="both"/>
-        <w:rPr>
-          <w:b/>
-          <w:bCs/>
-        </w:rPr>
-      </w:pPr>
-    </w:p>
-    <w:p>
-      <w:pPr>
-        <w:spacing w:after="0"/>
-        <w:jc w:val="both"/>
-        <w:rPr>
-          <w:b/>
-          <w:bCs/>
-        </w:rPr>
-      </w:pPr>
-    </w:p>
-    <w:p>
-      <w:pPr>
-        <w:spacing w:after="0"/>
-        <w:jc w:val="both"/>
-        <w:rPr>
-          <w:b/>
-          <w:bCs/>
-        </w:rPr>
-      </w:pPr>
-    </w:p>
-    <w:p>
-      <w:pPr>
-        <w:spacing w:after="0"/>
-        <w:jc w:val="both"/>
-        <w:rPr>
-          <w:b/>
-          <w:bCs/>
-          <w:sz w:val="28"/>
-          <w:szCs w:val="28"/>
-        </w:rPr>
-      </w:pPr>
-      <w:r>
-        <w:rPr>
-          <w:b/>
-          <w:bCs/>
-          <w:sz w:val="28"/>
-          <w:szCs w:val="28"/>
-        </w:rPr>
-        <w:t>3.6 Requisitos no funcionales</w:t>
-      </w:r>
-    </w:p>
-    <w:p>
-      <w:pPr>
-        <w:spacing w:after="0"/>
-        <w:jc w:val="both"/>
-      </w:pPr>
-    </w:p>
-    <w:p>
-      <w:pPr>
-        <w:spacing w:after="0"/>
-        <w:jc w:val="both"/>
-      </w:pPr>
-      <w:r>
-        <w:t xml:space="preserve">Los requisitos no funcionales establecen las condiciones de calidad, restricciones y características que debe cumplir </w:t>
-      </w:r>
-      <w:r>
-        <w:rPr>
-          <w:b/>
-          <w:bCs/>
-        </w:rPr>
-        <w:t>YENJO 1.0</w:t>
-      </w:r>
-      <w:r>
-        <w:t xml:space="preserve"> durante su funcionamiento. Estos requisitos complementan las funcionalidades definidas anteriormente y permiten establecer criterios relacionados con la seguridad, usabilidad, rendimiento, disponibilidad, mantenibilidad y capacidad de evolución de la solución.</w:t>
-      </w:r>
-    </w:p>
-    <w:p>
-      <w:pPr>
-        <w:spacing w:after="0"/>
-        <w:jc w:val="both"/>
-      </w:pPr>
-      <w:r>
-        <w:t xml:space="preserve">Para facilitar su identificación y seguimiento, cada requisito no funcional se identificará mediante el prefijo </w:t>
-      </w:r>
-      <w:r>
-        <w:rPr>
-          <w:b/>
-          <w:bCs/>
-        </w:rPr>
-        <w:t>RNF</w:t>
-      </w:r>
-      <w:r>
-        <w:t>, seguido de un número consecutivo.</w:t>
-      </w:r>
-    </w:p>
-    <w:p>
-      <w:pPr>
-        <w:spacing w:after="0"/>
-        <w:jc w:val="both"/>
-      </w:pPr>
-    </w:p>
-    <w:p>
-      <w:pPr>
-        <w:spacing w:after="0"/>
-        <w:jc w:val="both"/>
-        <w:rPr>
-          <w:b/>
-          <w:bCs/>
-        </w:rPr>
-      </w:pPr>
-      <w:r>
-        <w:rPr>
-          <w:b/>
-          <w:bCs/>
-        </w:rPr>
-        <w:t>3.6.1 Usabilidad</w:t>
-      </w:r>
-    </w:p>
-    <w:p>
-      <w:pPr>
-        <w:spacing w:after="0"/>
-        <w:jc w:val="both"/>
-        <w:rPr>
-          <w:b/>
-          <w:bCs/>
-        </w:rPr>
-      </w:pPr>
-      <w:r>
-        <w:rPr>
-          <w:b/>
-          <w:bCs/>
-        </w:rPr>
-        <w:t>RNF-001 — Interfaz intuitiva</w:t>
-      </w:r>
-    </w:p>
-    <w:p>
-      <w:pPr>
-        <w:spacing w:after="0"/>
-        <w:jc w:val="both"/>
-      </w:pPr>
-      <w:r>
-        <w:t xml:space="preserve">La interfaz de </w:t>
-      </w:r>
-      <w:r>
-        <w:rPr>
-          <w:b/>
-          <w:bCs/>
-        </w:rPr>
-        <w:t>YENJO 1.0</w:t>
-      </w:r>
-      <w:r>
-        <w:t xml:space="preserve"> debe presentar una estructura clara, organizada y comprensible que facilite la navegación y el uso de las funcionalidades por parte de los diferentes actores.</w:t>
-      </w:r>
-    </w:p>
-    <w:p>
-      <w:pPr>
-        <w:spacing w:after="0"/>
-        <w:jc w:val="both"/>
-        <w:rPr>
-          <w:b/>
-          <w:bCs/>
-        </w:rPr>
-      </w:pPr>
-      <w:r>
-        <w:rPr>
-          <w:b/>
-          <w:bCs/>
-        </w:rPr>
-        <w:t>RNF-002 — Diseño adaptable</w:t>
-      </w:r>
-    </w:p>
-    <w:p>
-      <w:pPr>
-        <w:spacing w:after="0"/>
-        <w:jc w:val="both"/>
-      </w:pPr>
-      <w:r>
-        <w:t>La interfaz debe adaptarse a diferentes tamaños de pantalla y dispositivos, permitiendo una experiencia de uso adecuada en computadores, tabletas y dispositivos móviles.</w:t>
-      </w:r>
-    </w:p>
-    <w:p>
-      <w:pPr>
-        <w:spacing w:after="0"/>
-        <w:jc w:val="both"/>
-        <w:rPr>
-          <w:b/>
-          <w:bCs/>
-        </w:rPr>
-      </w:pPr>
-      <w:r>
-        <w:rPr>
-          <w:b/>
-          <w:bCs/>
-        </w:rPr>
-        <w:t>RNF-003 — Accesibilidad</w:t>
-      </w:r>
-    </w:p>
-    <w:p>
-      <w:pPr>
-        <w:spacing w:after="0"/>
-        <w:jc w:val="both"/>
-      </w:pPr>
-      <w:r>
-        <w:t>La solución debe considerar principios de accesibilidad que faciliten la interacción de los usuarios con los contenidos y funcionalidades disponibles.</w:t>
-      </w:r>
-    </w:p>
-    <w:p>
-      <w:pPr>
-        <w:spacing w:after="0"/>
-        <w:jc w:val="both"/>
-        <w:rPr>
-          <w:b/>
-          <w:bCs/>
-        </w:rPr>
-      </w:pPr>
-    </w:p>
-    <w:p>
-      <w:pPr>
-        <w:spacing w:after="0"/>
-        <w:jc w:val="both"/>
-        <w:rPr>
-          <w:b/>
-          <w:bCs/>
-        </w:rPr>
-      </w:pPr>
-    </w:p>
-    <w:p>
-      <w:pPr>
-        <w:spacing w:after="0"/>
-        <w:jc w:val="both"/>
-        <w:rPr>
-          <w:b/>
-          <w:bCs/>
-        </w:rPr>
-      </w:pPr>
-    </w:p>
-    <w:p>
-      <w:pPr>
-        <w:spacing w:after="0"/>
-        <w:jc w:val="both"/>
-        <w:rPr>
-          <w:b/>
-          <w:bCs/>
-        </w:rPr>
-      </w:pPr>
-      <w:r>
-        <w:rPr>
-          <w:b/>
-          <w:bCs/>
-        </w:rPr>
-        <w:lastRenderedPageBreak/>
-        <w:t>3.6.2 Seguridad</w:t>
-      </w:r>
-    </w:p>
-    <w:p>
-      <w:pPr>
-        <w:spacing w:after="0"/>
-        <w:jc w:val="both"/>
-        <w:rPr>
-          <w:b/>
-          <w:bCs/>
-        </w:rPr>
-      </w:pPr>
-      <w:r>
-        <w:rPr>
-          <w:b/>
-          <w:bCs/>
-        </w:rPr>
-        <w:t>RNF-004 — Protección de credenciales</w:t>
-      </w:r>
-    </w:p>
-    <w:p>
-      <w:pPr>
-        <w:spacing w:after="0"/>
-        <w:jc w:val="both"/>
-      </w:pPr>
-      <w:r>
-        <w:t>Las credenciales de acceso de los usuarios deben manejarse de forma segura, evitando su exposición y almacenamiento inadecuado.</w:t>
-      </w:r>
-    </w:p>
-    <w:p>
-      <w:pPr>
-        <w:spacing w:after="0"/>
-        <w:jc w:val="both"/>
-        <w:rPr>
-          <w:b/>
-          <w:bCs/>
-        </w:rPr>
-      </w:pPr>
-      <w:r>
-        <w:rPr>
-          <w:b/>
-          <w:bCs/>
-        </w:rPr>
-        <w:t>RNF-005 — Control de acceso</w:t>
-      </w:r>
-    </w:p>
-    <w:p>
-      <w:pPr>
-        <w:spacing w:after="0"/>
-        <w:jc w:val="both"/>
-      </w:pPr>
-      <w:r>
-        <w:t>El sistema debe restringir el acceso a las funcionalidades de acuerdo con el rol y los permisos asignados a cada usuario.</w:t>
-      </w:r>
-    </w:p>
-    <w:p>
-      <w:pPr>
-        <w:spacing w:after="0"/>
-        <w:jc w:val="both"/>
-        <w:rPr>
-          <w:b/>
-          <w:bCs/>
-        </w:rPr>
-      </w:pPr>
-      <w:r>
-        <w:rPr>
-          <w:b/>
-          <w:bCs/>
-        </w:rPr>
-        <w:t>RNF-006 — Protección de información</w:t>
-      </w:r>
-    </w:p>
-    <w:p>
-      <w:pPr>
-        <w:spacing w:after="0"/>
-        <w:jc w:val="both"/>
-      </w:pPr>
-      <w:r>
-        <w:t xml:space="preserve">La información gestionada por </w:t>
-      </w:r>
-      <w:r>
-        <w:rPr>
-          <w:b/>
-          <w:bCs/>
-        </w:rPr>
-        <w:t>YENJO 1.0</w:t>
-      </w:r>
-      <w:r>
-        <w:t xml:space="preserve"> debe contar con mecanismos que reduzcan el riesgo de acceso, modificación o divulgación no autorizada.</w:t>
-      </w:r>
-    </w:p>
-    <w:p>
-      <w:pPr>
-        <w:spacing w:after="0"/>
-        <w:jc w:val="both"/>
-      </w:pPr>
-    </w:p>
-    <w:p>
-      <w:pPr>
-        <w:spacing w:after="0"/>
-        <w:jc w:val="both"/>
-        <w:rPr>
-          <w:b/>
-          <w:bCs/>
-        </w:rPr>
-      </w:pPr>
-      <w:r>
-        <w:rPr>
-          <w:b/>
-          <w:bCs/>
-        </w:rPr>
-        <w:t>3.6.3 Rendimiento</w:t>
-      </w:r>
-    </w:p>
-    <w:p>
-      <w:pPr>
-        <w:spacing w:after="0"/>
-        <w:jc w:val="both"/>
-        <w:rPr>
-          <w:b/>
-          <w:bCs/>
-        </w:rPr>
-      </w:pPr>
-      <w:r>
-        <w:rPr>
-          <w:b/>
-          <w:bCs/>
-        </w:rPr>
-        <w:t>RNF-007 — Tiempo de respuesta</w:t>
-      </w:r>
-    </w:p>
-    <w:p>
-      <w:pPr>
-        <w:spacing w:after="0"/>
-        <w:jc w:val="both"/>
-      </w:pPr>
-      <w:r>
-        <w:t>Las operaciones principales del sistema deben responder en tiempos adecuados para permitir una interacción fluida por parte de los usuarios.</w:t>
-      </w:r>
-    </w:p>
-    <w:p>
-      <w:pPr>
-        <w:spacing w:after="0"/>
-        <w:jc w:val="both"/>
-        <w:rPr>
-          <w:b/>
-          <w:bCs/>
-        </w:rPr>
-      </w:pPr>
-      <w:r>
-        <w:rPr>
-          <w:b/>
-          <w:bCs/>
-        </w:rPr>
-        <w:t>RNF-008 — Gestión eficiente de recursos</w:t>
-      </w:r>
-    </w:p>
-    <w:p>
-      <w:pPr>
-        <w:spacing w:after="0"/>
-        <w:jc w:val="both"/>
-      </w:pPr>
-      <w:r>
-        <w:t>La solución debe utilizar de manera eficiente los recursos disponibles, evitando procesos innecesarios que puedan afectar el rendimiento del sistema.</w:t>
-      </w:r>
-    </w:p>
-    <w:p>
-      <w:pPr>
-        <w:spacing w:after="0"/>
-        <w:jc w:val="both"/>
-      </w:pPr>
-    </w:p>
-    <w:p>
-      <w:pPr>
-        <w:spacing w:after="0"/>
-        <w:jc w:val="both"/>
-        <w:rPr>
-          <w:b/>
-          <w:bCs/>
-        </w:rPr>
-      </w:pPr>
-      <w:r>
-        <w:rPr>
-          <w:b/>
-          <w:bCs/>
-        </w:rPr>
-        <w:t>3.6.4 Disponibilidad</w:t>
-      </w:r>
-    </w:p>
-    <w:p>
-      <w:pPr>
-        <w:spacing w:after="0"/>
-        <w:jc w:val="both"/>
-        <w:rPr>
-          <w:b/>
-          <w:bCs/>
-        </w:rPr>
-      </w:pPr>
-      <w:r>
-        <w:rPr>
-          <w:b/>
-          <w:bCs/>
-        </w:rPr>
-        <w:t>RNF-009 — Disponibilidad del servicio</w:t>
-      </w:r>
-    </w:p>
-    <w:p>
-      <w:pPr>
-        <w:spacing w:after="0"/>
-        <w:jc w:val="both"/>
-      </w:pPr>
-      <w:r>
-        <w:t xml:space="preserve">Las funcionalidades de </w:t>
-      </w:r>
-      <w:r>
-        <w:rPr>
-          <w:b/>
-          <w:bCs/>
-        </w:rPr>
-        <w:t>YENJO 1.0</w:t>
-      </w:r>
-      <w:r>
-        <w:t xml:space="preserve"> deben encontrarse disponibles para los usuarios autorizados durante los periodos definidos para la operación de la plataforma.</w:t>
-      </w:r>
-    </w:p>
-    <w:p>
-      <w:pPr>
-        <w:spacing w:after="0"/>
-        <w:jc w:val="both"/>
-        <w:rPr>
-          <w:b/>
-          <w:bCs/>
-        </w:rPr>
-      </w:pPr>
-      <w:r>
-        <w:rPr>
-          <w:b/>
-          <w:bCs/>
-        </w:rPr>
-        <w:t>RNF-010 — Manejo de errores</w:t>
-      </w:r>
-    </w:p>
-    <w:p>
-      <w:pPr>
-        <w:spacing w:after="0"/>
-        <w:jc w:val="both"/>
-      </w:pPr>
-      <w:r>
-        <w:t>El sistema debe proporcionar mensajes claros cuando se presenten errores o situaciones que impidan completar una operación, evitando que el usuario quede sin información sobre lo ocurrido.</w:t>
-      </w:r>
-    </w:p>
-    <w:p>
-      <w:pPr>
-        <w:spacing w:after="0"/>
-        <w:jc w:val="both"/>
-      </w:pPr>
-    </w:p>
-    <w:p>
-      <w:pPr>
-        <w:spacing w:after="0"/>
-        <w:jc w:val="both"/>
-        <w:rPr>
-          <w:b/>
-          <w:bCs/>
-        </w:rPr>
-      </w:pPr>
-      <w:r>
-        <w:rPr>
-          <w:b/>
-          <w:bCs/>
-        </w:rPr>
-        <w:t>3.6.5 Mantenibilidad</w:t>
-      </w:r>
-    </w:p>
-    <w:p>
-      <w:pPr>
-        <w:spacing w:after="0"/>
-        <w:jc w:val="both"/>
-        <w:rPr>
-          <w:b/>
-          <w:bCs/>
-        </w:rPr>
-      </w:pPr>
-      <w:r>
-        <w:rPr>
-          <w:b/>
-          <w:bCs/>
-        </w:rPr>
-        <w:t>RNF-011 — Código organizado</w:t>
-      </w:r>
-    </w:p>
-    <w:p>
-      <w:pPr>
-        <w:spacing w:after="0"/>
-        <w:jc w:val="both"/>
-      </w:pPr>
-      <w:r>
-        <w:t>El software debe mantener una estructura organizada y modular que facilite las actividades de mantenimiento, corrección y actualización.</w:t>
-      </w:r>
-    </w:p>
-    <w:p>
-      <w:pPr>
-        <w:spacing w:after="0"/>
-        <w:jc w:val="both"/>
-        <w:rPr>
-          <w:b/>
-          <w:bCs/>
-        </w:rPr>
-      </w:pPr>
-      <w:r>
-        <w:rPr>
-          <w:b/>
-          <w:bCs/>
-        </w:rPr>
-        <w:t>RNF-012 — Documentación técnica</w:t>
-      </w:r>
-    </w:p>
-    <w:p>
-      <w:pPr>
-        <w:spacing w:after="0"/>
-        <w:jc w:val="both"/>
-      </w:pPr>
-      <w:r>
-        <w:t>Los componentes principales de la solución deben contar con documentación suficiente para facilitar su comprensión y mantenimiento posterior.</w:t>
-      </w:r>
-    </w:p>
-    <w:p>
-      <w:pPr>
-        <w:spacing w:after="0"/>
-        <w:jc w:val="both"/>
-      </w:pPr>
-    </w:p>
-    <w:p>
-      <w:pPr>
-        <w:spacing w:after="0"/>
-        <w:jc w:val="both"/>
-        <w:rPr>
-          <w:b/>
-          <w:bCs/>
-        </w:rPr>
-      </w:pPr>
-      <w:r>
-        <w:rPr>
-          <w:b/>
-          <w:bCs/>
-        </w:rPr>
-        <w:t>3.6.6 Escalabilidad</w:t>
-      </w:r>
-    </w:p>
-    <w:p>
-      <w:pPr>
-        <w:spacing w:after="0"/>
-        <w:jc w:val="both"/>
-        <w:rPr>
-          <w:b/>
-          <w:bCs/>
-        </w:rPr>
-      </w:pPr>
-      <w:r>
-        <w:rPr>
-          <w:b/>
-          <w:bCs/>
-        </w:rPr>
-        <w:t>RNF-013 — Capacidad de crecimiento</w:t>
-      </w:r>
-    </w:p>
-    <w:p>
-      <w:pPr>
-        <w:spacing w:after="0"/>
-        <w:jc w:val="both"/>
-      </w:pPr>
-      <w:r>
-        <w:t xml:space="preserve">La arquitectura de </w:t>
-      </w:r>
-      <w:r>
-        <w:rPr>
-          <w:b/>
-          <w:bCs/>
-        </w:rPr>
-        <w:t>YENJO 1.0</w:t>
-      </w:r>
-      <w:r>
-        <w:t xml:space="preserve"> debe permitir incorporar nuevas funcionalidades, servicios y usuarios sin requerir modificaciones estructurales que comprometan el funcionamiento general de la solución.</w:t>
-      </w:r>
-    </w:p>
-    <w:p>
-      <w:pPr>
-        <w:spacing w:after="0"/>
-        <w:jc w:val="both"/>
-        <w:rPr>
-          <w:b/>
-          <w:bCs/>
-        </w:rPr>
-      </w:pPr>
-      <w:r>
-        <w:rPr>
-          <w:b/>
-          <w:bCs/>
-        </w:rPr>
-        <w:t>RNF-014 — Modularidad</w:t>
-      </w:r>
-    </w:p>
-    <w:p>
-      <w:pPr>
-        <w:spacing w:after="0"/>
-        <w:jc w:val="both"/>
-      </w:pPr>
-      <w:r>
-        <w:t>La solución debe mantener una separación adecuada entre sus principales componentes, facilitando su evolución y la incorporación de nuevos módulos.</w:t>
-      </w:r>
-    </w:p>
-    <w:p>
-      <w:pPr>
-        <w:spacing w:after="0"/>
-        <w:jc w:val="both"/>
-        <w:rPr>
-          <w:b/>
-          <w:bCs/>
-        </w:rPr>
-      </w:pPr>
-    </w:p>
-    <w:p>
-      <w:pPr>
-        <w:spacing w:after="0"/>
-        <w:jc w:val="both"/>
-        <w:rPr>
-          <w:b/>
-          <w:bCs/>
-        </w:rPr>
-      </w:pPr>
       <w:r>
         <w:rPr>
           <w:rFonts w:ascii="Arial Black" w:hAnsi="Arial Black"/>
           <w:sz w:val="20"/>
           <w:szCs w:val="20"/>
         </w:rPr>
+        <w:t>Tabla 3.1 Resumen RF</w:t>
+      </w:r>
+    </w:p>
+    <w:p>
+      <w:pPr>
+        <w:spacing w:after="0"/>
+        <w:jc w:val="both"/>
+        <w:rPr>
+          <w:b/>
+          <w:bCs/>
+        </w:rPr>
+      </w:pPr>
+    </w:p>
+    <w:p>
+      <w:pPr>
+        <w:spacing w:after="0"/>
+        <w:jc w:val="both"/>
+        <w:rPr>
+          <w:b/>
+          <w:bCs/>
+        </w:rPr>
+      </w:pPr>
+    </w:p>
+    <w:p>
+      <w:pPr>
+        <w:spacing w:after="0"/>
+        <w:jc w:val="both"/>
+        <w:rPr>
+          <w:b/>
+          <w:bCs/>
+        </w:rPr>
+      </w:pPr>
+    </w:p>
+    <w:p>
+      <w:pPr>
+        <w:spacing w:after="0"/>
+        <w:jc w:val="both"/>
+        <w:rPr>
+          <w:b/>
+          <w:bCs/>
+        </w:rPr>
+      </w:pPr>
+    </w:p>
+    <w:p>
+      <w:pPr>
+        <w:spacing w:after="0"/>
+        <w:jc w:val="both"/>
+        <w:rPr>
+          <w:b/>
+          <w:bCs/>
+        </w:rPr>
+      </w:pPr>
+    </w:p>
+    <w:p>
+      <w:pPr>
+        <w:spacing w:after="0"/>
+        <w:jc w:val="both"/>
+        <w:rPr>
+          <w:b/>
+          <w:bCs/>
+        </w:rPr>
+      </w:pPr>
+    </w:p>
+    <w:p>
+      <w:pPr>
+        <w:spacing w:after="0"/>
+        <w:jc w:val="both"/>
+        <w:rPr>
+          <w:b/>
+          <w:bCs/>
+        </w:rPr>
+      </w:pPr>
+    </w:p>
+    <w:p>
+      <w:pPr>
+        <w:spacing w:after="0"/>
+        <w:jc w:val="both"/>
+        <w:rPr>
+          <w:b/>
+          <w:bCs/>
+        </w:rPr>
+      </w:pPr>
+    </w:p>
+    <w:p>
+      <w:pPr>
+        <w:spacing w:after="0"/>
+        <w:jc w:val="both"/>
+        <w:rPr>
+          <w:b/>
+          <w:bCs/>
+        </w:rPr>
+      </w:pPr>
+    </w:p>
+    <w:p>
+      <w:pPr>
+        <w:spacing w:after="0"/>
+        <w:jc w:val="both"/>
+        <w:rPr>
+          <w:b/>
+          <w:bCs/>
+        </w:rPr>
+      </w:pPr>
+    </w:p>
+    <w:p>
+      <w:pPr>
+        <w:spacing w:after="0"/>
+        <w:jc w:val="both"/>
+        <w:rPr>
+          <w:b/>
+          <w:bCs/>
+        </w:rPr>
+      </w:pPr>
+    </w:p>
+    <w:p>
+      <w:pPr>
+        <w:spacing w:after="0"/>
+        <w:jc w:val="both"/>
+        <w:rPr>
+          <w:b/>
+          <w:bCs/>
+        </w:rPr>
+      </w:pPr>
+    </w:p>
+    <w:p>
+      <w:pPr>
+        <w:spacing w:after="0"/>
+        <w:jc w:val="both"/>
+        <w:rPr>
+          <w:b/>
+          <w:bCs/>
+        </w:rPr>
+      </w:pPr>
+    </w:p>
+    <w:p>
+      <w:pPr>
+        <w:spacing w:after="0"/>
+        <w:jc w:val="both"/>
+        <w:rPr>
+          <w:b/>
+          <w:bCs/>
+        </w:rPr>
+      </w:pPr>
+    </w:p>
+    <w:p>
+      <w:pPr>
+        <w:spacing w:after="0"/>
+        <w:jc w:val="both"/>
+        <w:rPr>
+          <w:b/>
+          <w:bCs/>
+        </w:rPr>
+      </w:pPr>
+    </w:p>
+    <w:p>
+      <w:pPr>
+        <w:spacing w:after="0"/>
+        <w:jc w:val="both"/>
+        <w:rPr>
+          <w:b/>
+          <w:bCs/>
+        </w:rPr>
+      </w:pPr>
+    </w:p>
+    <w:p>
+      <w:pPr>
+        <w:spacing w:after="0"/>
+        <w:jc w:val="both"/>
+        <w:rPr>
+          <w:b/>
+          <w:bCs/>
+        </w:rPr>
+      </w:pPr>
+    </w:p>
+    <w:p>
+      <w:pPr>
+        <w:spacing w:after="0"/>
+        <w:jc w:val="both"/>
+        <w:rPr>
+          <w:b/>
+          <w:bCs/>
+        </w:rPr>
+      </w:pPr>
+    </w:p>
+    <w:p>
+      <w:pPr>
+        <w:spacing w:after="0"/>
+        <w:jc w:val="both"/>
+        <w:rPr>
+          <w:b/>
+          <w:bCs/>
+        </w:rPr>
+      </w:pPr>
+    </w:p>
+    <w:p>
+      <w:pPr>
+        <w:spacing w:after="0"/>
+        <w:jc w:val="both"/>
+        <w:rPr>
+          <w:b/>
+          <w:bCs/>
+        </w:rPr>
+      </w:pPr>
+    </w:p>
+    <w:p>
+      <w:pPr>
+        <w:spacing w:after="0"/>
+        <w:jc w:val="both"/>
+        <w:rPr>
+          <w:b/>
+          <w:bCs/>
+          <w:sz w:val="28"/>
+          <w:szCs w:val="28"/>
+        </w:rPr>
+      </w:pPr>
+      <w:r>
+        <w:rPr>
+          <w:b/>
+          <w:bCs/>
+          <w:sz w:val="28"/>
+          <w:szCs w:val="28"/>
+        </w:rPr>
+        <w:t>3.6 Requisitos no funcionales</w:t>
+      </w:r>
+    </w:p>
+    <w:p>
+      <w:pPr>
+        <w:spacing w:after="0"/>
+        <w:jc w:val="both"/>
+      </w:pPr>
+    </w:p>
+    <w:p>
+      <w:pPr>
+        <w:spacing w:after="0"/>
+        <w:jc w:val="both"/>
+      </w:pPr>
+      <w:r>
+        <w:t xml:space="preserve">Los requisitos no funcionales establecen las condiciones de calidad, restricciones y características que debe cumplir </w:t>
+      </w:r>
+      <w:r>
+        <w:rPr>
+          <w:b/>
+          <w:bCs/>
+        </w:rPr>
+        <w:t>YENJO 1.0</w:t>
+      </w:r>
+      <w:r>
+        <w:t xml:space="preserve"> durante su funcionamiento. Estos requisitos complementan las funcionalidades definidas anteriormente y permiten establecer criterios relacionados con la seguridad, usabilidad, rendimiento, disponibilidad, mantenibilidad y capacidad de evolución de la solución.</w:t>
+      </w:r>
+    </w:p>
+    <w:p>
+      <w:pPr>
+        <w:spacing w:after="0"/>
+        <w:jc w:val="both"/>
+      </w:pPr>
+      <w:r>
+        <w:t xml:space="preserve">Para facilitar su identificación y seguimiento, cada requisito no funcional se identificará mediante el prefijo </w:t>
+      </w:r>
+      <w:r>
+        <w:rPr>
+          <w:b/>
+          <w:bCs/>
+        </w:rPr>
+        <w:t>RNF</w:t>
+      </w:r>
+      <w:r>
+        <w:t>, seguido de un número consecutivo.</w:t>
+      </w:r>
+    </w:p>
+    <w:p>
+      <w:pPr>
+        <w:spacing w:after="0"/>
+        <w:jc w:val="both"/>
+      </w:pPr>
+    </w:p>
+    <w:p>
+      <w:pPr>
+        <w:spacing w:after="0"/>
+        <w:jc w:val="both"/>
+        <w:rPr>
+          <w:b/>
+          <w:bCs/>
+        </w:rPr>
+      </w:pPr>
+      <w:r>
+        <w:rPr>
+          <w:b/>
+          <w:bCs/>
+        </w:rPr>
+        <w:t>3.6.1 Usabilidad</w:t>
+      </w:r>
+    </w:p>
+    <w:p>
+      <w:pPr>
+        <w:spacing w:after="0"/>
+        <w:jc w:val="both"/>
+        <w:rPr>
+          <w:b/>
+          <w:bCs/>
+        </w:rPr>
+      </w:pPr>
+      <w:r>
+        <w:rPr>
+          <w:b/>
+          <w:bCs/>
+        </w:rPr>
+        <w:t>RNF-001 — Interfaz intuitiva</w:t>
+      </w:r>
+    </w:p>
+    <w:p>
+      <w:pPr>
+        <w:spacing w:after="0"/>
+        <w:jc w:val="both"/>
+      </w:pPr>
+      <w:r>
+        <w:t xml:space="preserve">La interfaz de </w:t>
+      </w:r>
+      <w:r>
+        <w:rPr>
+          <w:b/>
+          <w:bCs/>
+        </w:rPr>
+        <w:t>YENJO 1.0</w:t>
+      </w:r>
+      <w:r>
+        <w:t xml:space="preserve"> debe presentar una estructura clara, organizada y comprensible que facilite la navegación y el uso de las funcionalidades por parte de los diferentes actores.</w:t>
+      </w:r>
+    </w:p>
+    <w:p>
+      <w:pPr>
+        <w:spacing w:after="0"/>
+        <w:jc w:val="both"/>
+        <w:rPr>
+          <w:b/>
+          <w:bCs/>
+        </w:rPr>
+      </w:pPr>
+      <w:r>
+        <w:rPr>
+          <w:b/>
+          <w:bCs/>
+        </w:rPr>
+        <w:t>RNF-002 — Diseño adaptable</w:t>
+      </w:r>
+    </w:p>
+    <w:p>
+      <w:pPr>
+        <w:spacing w:after="0"/>
+        <w:jc w:val="both"/>
+      </w:pPr>
+      <w:r>
+        <w:t>La interfaz debe adaptarse a diferentes tamaños de pantalla y dispositivos, permitiendo una experiencia de uso adecuada en computadores, tabletas y dispositivos móviles.</w:t>
+      </w:r>
+    </w:p>
+    <w:p>
+      <w:pPr>
+        <w:spacing w:after="0"/>
+        <w:jc w:val="both"/>
+        <w:rPr>
+          <w:b/>
+          <w:bCs/>
+        </w:rPr>
+      </w:pPr>
+      <w:r>
+        <w:rPr>
+          <w:b/>
+          <w:bCs/>
+        </w:rPr>
+        <w:t>RNF-003 — Accesibilidad</w:t>
+      </w:r>
+    </w:p>
+    <w:p>
+      <w:pPr>
+        <w:spacing w:after="0"/>
+        <w:jc w:val="both"/>
+      </w:pPr>
+      <w:r>
+        <w:t>La solución debe considerar principios de accesibilidad que faciliten la interacción de los usuarios con los contenidos y funcionalidades disponibles.</w:t>
+      </w:r>
+    </w:p>
+    <w:p>
+      <w:pPr>
+        <w:spacing w:after="0"/>
+        <w:jc w:val="both"/>
+        <w:rPr>
+          <w:b/>
+          <w:bCs/>
+        </w:rPr>
+      </w:pPr>
+      <w:r>
+        <w:rPr>
+          <w:b/>
+          <w:bCs/>
+        </w:rPr>
         <w:lastRenderedPageBreak/>
-        <w:t>Tabla 3.</w:t>
-      </w:r>
+        <w:t>3.6.2 Seguridad</w:t>
+      </w:r>
+    </w:p>
+    <w:p>
+      <w:pPr>
+        <w:spacing w:after="0"/>
+        <w:jc w:val="both"/>
+        <w:rPr>
+          <w:b/>
+          <w:bCs/>
+        </w:rPr>
+      </w:pPr>
+      <w:r>
+        <w:rPr>
+          <w:b/>
+          <w:bCs/>
+        </w:rPr>
+        <w:t>RNF-004 — Protección de credenciales</w:t>
+      </w:r>
+    </w:p>
+    <w:p>
+      <w:pPr>
+        <w:spacing w:after="0"/>
+        <w:jc w:val="both"/>
+      </w:pPr>
+      <w:r>
+        <w:t>Las credenciales de acceso de los usuarios deben manejarse de forma segura, evitando su exposición y almacenamiento inadecuado.</w:t>
+      </w:r>
+    </w:p>
+    <w:p>
+      <w:pPr>
+        <w:spacing w:after="0"/>
+        <w:jc w:val="both"/>
+        <w:rPr>
+          <w:b/>
+          <w:bCs/>
+        </w:rPr>
+      </w:pPr>
+      <w:r>
+        <w:rPr>
+          <w:b/>
+          <w:bCs/>
+        </w:rPr>
+        <w:t>RNF-005 — Control de acceso</w:t>
+      </w:r>
+    </w:p>
+    <w:p>
+      <w:pPr>
+        <w:spacing w:after="0"/>
+        <w:jc w:val="both"/>
+      </w:pPr>
+      <w:r>
+        <w:t>El sistema debe restringir el acceso a las funcionalidades de acuerdo con el rol y los permisos asignados a cada usuario.</w:t>
+      </w:r>
+    </w:p>
+    <w:p>
+      <w:pPr>
+        <w:spacing w:after="0"/>
+        <w:jc w:val="both"/>
+        <w:rPr>
+          <w:b/>
+          <w:bCs/>
+        </w:rPr>
+      </w:pPr>
+      <w:r>
+        <w:rPr>
+          <w:b/>
+          <w:bCs/>
+        </w:rPr>
+        <w:t>RNF-006 — Protección de información</w:t>
+      </w:r>
+    </w:p>
+    <w:p>
+      <w:pPr>
+        <w:spacing w:after="0"/>
+        <w:jc w:val="both"/>
+      </w:pPr>
+      <w:r>
+        <w:t xml:space="preserve">La información gestionada por </w:t>
+      </w:r>
+      <w:r>
+        <w:rPr>
+          <w:b/>
+          <w:bCs/>
+        </w:rPr>
+        <w:t>YENJO 1.0</w:t>
+      </w:r>
+      <w:r>
+        <w:t xml:space="preserve"> debe contar con mecanismos que reduzcan el riesgo de acceso, modificación o divulgación no autorizada.</w:t>
+      </w:r>
+    </w:p>
+    <w:p>
+      <w:pPr>
+        <w:spacing w:after="0"/>
+        <w:jc w:val="both"/>
+      </w:pPr>
+    </w:p>
+    <w:p>
+      <w:pPr>
+        <w:spacing w:after="0"/>
+        <w:jc w:val="both"/>
+        <w:rPr>
+          <w:b/>
+          <w:bCs/>
+        </w:rPr>
+      </w:pPr>
+      <w:r>
+        <w:rPr>
+          <w:b/>
+          <w:bCs/>
+        </w:rPr>
+        <w:t>3.6.3 Rendimiento</w:t>
+      </w:r>
+    </w:p>
+    <w:p>
+      <w:pPr>
+        <w:spacing w:after="0"/>
+        <w:jc w:val="both"/>
+        <w:rPr>
+          <w:b/>
+          <w:bCs/>
+        </w:rPr>
+      </w:pPr>
+      <w:r>
+        <w:rPr>
+          <w:b/>
+          <w:bCs/>
+        </w:rPr>
+        <w:t>RNF-007 — Tiempo de respuesta</w:t>
+      </w:r>
+    </w:p>
+    <w:p>
+      <w:pPr>
+        <w:spacing w:after="0"/>
+        <w:jc w:val="both"/>
+      </w:pPr>
+      <w:r>
+        <w:t>Las operaciones principales del sistema deben responder en tiempos adecuados para permitir una interacción fluida por parte de los usuarios.</w:t>
+      </w:r>
+    </w:p>
+    <w:p>
+      <w:pPr>
+        <w:spacing w:after="0"/>
+        <w:jc w:val="both"/>
+        <w:rPr>
+          <w:b/>
+          <w:bCs/>
+        </w:rPr>
+      </w:pPr>
+      <w:r>
+        <w:rPr>
+          <w:b/>
+          <w:bCs/>
+        </w:rPr>
+        <w:t>RNF-008 — Gestión eficiente de recursos</w:t>
+      </w:r>
+    </w:p>
+    <w:p>
+      <w:pPr>
+        <w:spacing w:after="0"/>
+        <w:jc w:val="both"/>
+      </w:pPr>
+      <w:r>
+        <w:t>La solución debe utilizar de manera eficiente los recursos disponibles, evitando procesos innecesarios que puedan afectar el rendimiento del sistema.</w:t>
+      </w:r>
+    </w:p>
+    <w:p>
+      <w:pPr>
+        <w:spacing w:after="0"/>
+        <w:jc w:val="both"/>
+      </w:pPr>
+    </w:p>
+    <w:p>
+      <w:pPr>
+        <w:spacing w:after="0"/>
+        <w:jc w:val="both"/>
+        <w:rPr>
+          <w:b/>
+          <w:bCs/>
+        </w:rPr>
+      </w:pPr>
+      <w:r>
+        <w:rPr>
+          <w:b/>
+          <w:bCs/>
+        </w:rPr>
+        <w:t>3.6.4 Disponibilidad</w:t>
+      </w:r>
+    </w:p>
+    <w:p>
+      <w:pPr>
+        <w:spacing w:after="0"/>
+        <w:jc w:val="both"/>
+        <w:rPr>
+          <w:b/>
+          <w:bCs/>
+        </w:rPr>
+      </w:pPr>
+      <w:r>
+        <w:rPr>
+          <w:b/>
+          <w:bCs/>
+        </w:rPr>
+        <w:t>RNF-009 — Disponibilidad del servicio</w:t>
+      </w:r>
+    </w:p>
+    <w:p>
+      <w:pPr>
+        <w:spacing w:after="0"/>
+        <w:jc w:val="both"/>
+      </w:pPr>
+      <w:r>
+        <w:t xml:space="preserve">Las funcionalidades de </w:t>
+      </w:r>
+      <w:r>
+        <w:rPr>
+          <w:b/>
+          <w:bCs/>
+        </w:rPr>
+        <w:t>YENJO 1.0</w:t>
+      </w:r>
+      <w:r>
+        <w:t xml:space="preserve"> deben encontrarse disponibles para los usuarios autorizados durante los periodos definidos para la operación de la plataforma.</w:t>
+      </w:r>
+    </w:p>
+    <w:p>
+      <w:pPr>
+        <w:spacing w:after="0"/>
+        <w:jc w:val="both"/>
+        <w:rPr>
+          <w:b/>
+          <w:bCs/>
+        </w:rPr>
+      </w:pPr>
+      <w:r>
+        <w:rPr>
+          <w:b/>
+          <w:bCs/>
+        </w:rPr>
+        <w:t>RNF-010 — Manejo de errores</w:t>
+      </w:r>
+    </w:p>
+    <w:p>
+      <w:pPr>
+        <w:spacing w:after="0"/>
+        <w:jc w:val="both"/>
+      </w:pPr>
+      <w:r>
+        <w:t>El sistema debe proporcionar mensajes claros cuando se presenten errores o situaciones que impidan completar una operación, evitando que el usuario quede sin información sobre lo ocurrido.</w:t>
+      </w:r>
+    </w:p>
+    <w:p>
+      <w:pPr>
+        <w:spacing w:after="0"/>
+        <w:jc w:val="both"/>
+      </w:pPr>
+    </w:p>
+    <w:p>
+      <w:pPr>
+        <w:spacing w:after="0"/>
+        <w:jc w:val="both"/>
+        <w:rPr>
+          <w:b/>
+          <w:bCs/>
+        </w:rPr>
+      </w:pPr>
+      <w:r>
+        <w:rPr>
+          <w:b/>
+          <w:bCs/>
+        </w:rPr>
+        <w:t>3.6.5 Mantenibilidad</w:t>
+      </w:r>
+    </w:p>
+    <w:p>
+      <w:pPr>
+        <w:spacing w:after="0"/>
+        <w:jc w:val="both"/>
+        <w:rPr>
+          <w:b/>
+          <w:bCs/>
+        </w:rPr>
+      </w:pPr>
+      <w:r>
+        <w:rPr>
+          <w:b/>
+          <w:bCs/>
+        </w:rPr>
+        <w:t>RNF-011 — Código organizado</w:t>
+      </w:r>
+    </w:p>
+    <w:p>
+      <w:pPr>
+        <w:spacing w:after="0"/>
+        <w:jc w:val="both"/>
+      </w:pPr>
+      <w:r>
+        <w:t>El software debe mantener una estructura organizada y modular que facilite las actividades de mantenimiento, corrección y actualización.</w:t>
+      </w:r>
+    </w:p>
+    <w:p>
+      <w:pPr>
+        <w:spacing w:after="0"/>
+        <w:jc w:val="both"/>
+        <w:rPr>
+          <w:b/>
+          <w:bCs/>
+        </w:rPr>
+      </w:pPr>
+      <w:r>
+        <w:rPr>
+          <w:b/>
+          <w:bCs/>
+        </w:rPr>
+        <w:t>RNF-012 — Documentación técnica</w:t>
+      </w:r>
+    </w:p>
+    <w:p>
+      <w:pPr>
+        <w:spacing w:after="0"/>
+        <w:jc w:val="both"/>
+      </w:pPr>
+      <w:r>
+        <w:t>Los componentes principales de la solución deben contar con documentación suficiente para facilitar su comprensión y mantenimiento posterior.</w:t>
+      </w:r>
+    </w:p>
+    <w:p>
+      <w:pPr>
+        <w:spacing w:after="0"/>
+        <w:jc w:val="both"/>
+      </w:pPr>
+    </w:p>
+    <w:p>
+      <w:pPr>
+        <w:spacing w:after="0"/>
+        <w:jc w:val="both"/>
+        <w:rPr>
+          <w:b/>
+          <w:bCs/>
+        </w:rPr>
+      </w:pPr>
+      <w:r>
+        <w:rPr>
+          <w:b/>
+          <w:bCs/>
+        </w:rPr>
+        <w:t>3.6.6 Escalabilidad</w:t>
+      </w:r>
+    </w:p>
+    <w:p>
+      <w:pPr>
+        <w:spacing w:after="0"/>
+        <w:jc w:val="both"/>
+        <w:rPr>
+          <w:b/>
+          <w:bCs/>
+        </w:rPr>
+      </w:pPr>
+      <w:r>
+        <w:rPr>
+          <w:b/>
+          <w:bCs/>
+        </w:rPr>
+        <w:t>RNF-013 — Capacidad de crecimiento</w:t>
+      </w:r>
+    </w:p>
+    <w:p>
+      <w:pPr>
+        <w:spacing w:after="0"/>
+        <w:jc w:val="both"/>
+      </w:pPr>
+      <w:r>
+        <w:t xml:space="preserve">La arquitectura de </w:t>
+      </w:r>
+      <w:r>
+        <w:rPr>
+          <w:b/>
+          <w:bCs/>
+        </w:rPr>
+        <w:t>YENJO 1.0</w:t>
+      </w:r>
+      <w:r>
+        <w:t xml:space="preserve"> debe permitir incorporar nuevas funcionalidades, servicios y usuarios sin requerir modificaciones estructurales que comprometan el funcionamiento general de la solución.</w:t>
+      </w:r>
+    </w:p>
+    <w:p>
+      <w:pPr>
+        <w:spacing w:after="0"/>
+        <w:jc w:val="both"/>
+        <w:rPr>
+          <w:b/>
+          <w:bCs/>
+        </w:rPr>
+      </w:pPr>
+    </w:p>
+    <w:p>
+      <w:pPr>
+        <w:spacing w:after="0"/>
+        <w:jc w:val="both"/>
+        <w:rPr>
+          <w:b/>
+          <w:bCs/>
+        </w:rPr>
+      </w:pPr>
+      <w:r>
+        <w:rPr>
+          <w:b/>
+          <w:bCs/>
+        </w:rPr>
+        <w:t>RNF-014 — Modularidad</w:t>
+      </w:r>
+    </w:p>
+    <w:p>
+      <w:pPr>
+        <w:spacing w:after="0"/>
+        <w:jc w:val="both"/>
+      </w:pPr>
+      <w:r>
+        <w:t>La solución debe mantener una separación adecuada entre sus principales componentes, facilitando su evolución y la incorporación de nuevos módulos.</w:t>
+      </w:r>
+    </w:p>
+    <w:p>
+      <w:pPr>
+        <w:spacing w:after="0"/>
+        <w:jc w:val="both"/>
+        <w:rPr>
+          <w:b/>
+          <w:bCs/>
+        </w:rPr>
+      </w:pPr>
       <w:r>
         <w:rPr>
           <w:rFonts w:ascii="Arial Black" w:hAnsi="Arial Black"/>
           <w:sz w:val="20"/>
           <w:szCs w:val="20"/>
         </w:rPr>
-        <w:t>2</w:t>
+        <w:lastRenderedPageBreak/>
+        <w:t>Tabla 3.</w:t>
       </w:r>
       <w:r>
         <w:rPr>
@@ -3523,17 +3542,15 @@
           <w:sz w:val="20"/>
           <w:szCs w:val="20"/>
         </w:rPr>
-        <w:t xml:space="preserve"> Resumen </w:t>
+        <w:t>2</w:t>
       </w:r>
       <w:r>
         <w:rPr>
           <w:rFonts w:ascii="Arial Black" w:hAnsi="Arial Black"/>
-          <w:b/>
-          <w:bCs/>
           <w:sz w:val="20"/>
           <w:szCs w:val="20"/>
         </w:rPr>
-        <w:t>R</w:t>
+        <w:t xml:space="preserve"> Resumen </w:t>
       </w:r>
       <w:r>
         <w:rPr>
@@ -3543,7 +3560,7 @@
           <w:sz w:val="20"/>
           <w:szCs w:val="20"/>
         </w:rPr>
-        <w:t>N</w:t>
+        <w:t>R</w:t>
       </w:r>
       <w:r>
         <w:rPr>
@@ -3553,6 +3570,16 @@
           <w:sz w:val="20"/>
           <w:szCs w:val="20"/>
         </w:rPr>
+        <w:t>N</w:t>
+      </w:r>
+      <w:r>
+        <w:rPr>
+          <w:rFonts w:ascii="Arial Black" w:hAnsi="Arial Black"/>
+          <w:b/>
+          <w:bCs/>
+          <w:sz w:val="20"/>
+          <w:szCs w:val="20"/>
+        </w:rPr>
         <w:t>F</w:t>
       </w:r>
     </w:p>
@@ -3570,15 +3597,15 @@
           <w:noProof/>
         </w:rPr>
         <w:drawing>
-          <wp:anchor distT="0" distB="0" distL="114300" distR="114300" simplePos="0" relativeHeight="251659264" behindDoc="1" locked="0" layoutInCell="1" allowOverlap="1" wp14:anchorId="66908886" wp14:editId="09C598BF">
+          <wp:anchor distT="0" distB="0" distL="114300" distR="114300" simplePos="0" relativeHeight="251659264" behindDoc="1" locked="0" layoutInCell="1" allowOverlap="1" wp14:anchorId="66908886" wp14:editId="0BC1A376">
             <wp:simplePos x="0" y="0"/>
             <wp:positionH relativeFrom="column">
               <wp:posOffset>-3810</wp:posOffset>
             </wp:positionH>
             <wp:positionV relativeFrom="paragraph">
-              <wp:posOffset>21590</wp:posOffset>
+              <wp:posOffset>18415</wp:posOffset>
             </wp:positionV>
-            <wp:extent cx="5610225" cy="3057525"/>
+            <wp:extent cx="5610225" cy="2867025"/>
             <wp:effectExtent l="0" t="0" r="9525" b="9525"/>
             <wp:wrapNone/>
             <wp:docPr id="2" name="Imagen 2"/>
@@ -3610,7 +3637,7 @@
                   <pic:spPr bwMode="auto">
                     <a:xfrm>
                       <a:off x="0" y="0"/>
-                      <a:ext cx="5610225" cy="3057525"/>
+                      <a:ext cx="5610225" cy="2867025"/>
                     </a:xfrm>
                     <a:prstGeom prst="rect">
                       <a:avLst/>
@@ -3623,6 +3650,9 @@
                 </pic:pic>
               </a:graphicData>
             </a:graphic>
+            <wp14:sizeRelV relativeFrom="margin">
+              <wp14:pctHeight>0</wp14:pctHeight>
+            </wp14:sizeRelV>
           </wp:anchor>
         </w:drawing>
       </w:r>
@@ -3751,12 +3781,6 @@
       <w:pPr>
         <w:spacing w:after="0"/>
         <w:jc w:val="both"/>
-      </w:pPr>
-    </w:p>
-    <w:p>
-      <w:pPr>
-        <w:spacing w:after="0"/>
-        <w:jc w:val="both"/>
         <w:rPr>
           <w:b/>
           <w:bCs/>
@@ -4104,26 +4128,71 @@
           <w:bCs/>
         </w:rPr>
       </w:pPr>
-    </w:p>
-    <w:p>
-      <w:pPr>
-        <w:spacing w:after="0"/>
-        <w:jc w:val="both"/>
-        <w:rPr>
-          <w:b/>
-          <w:bCs/>
-        </w:rPr>
-      </w:pPr>
-    </w:p>
-    <w:p>
-      <w:pPr>
-        <w:spacing w:after="0"/>
-        <w:jc w:val="both"/>
-        <w:rPr>
-          <w:b/>
-          <w:bCs/>
-        </w:rPr>
-      </w:pPr>
+      <w:r>
+        <w:rPr>
+          <w:b/>
+          <w:bCs/>
+        </w:rPr>
+        <w:t>HU-004 — Consulta de profesionales</w:t>
+      </w:r>
+    </w:p>
+    <w:p>
+      <w:pPr>
+        <w:spacing w:after="0"/>
+        <w:jc w:val="both"/>
+      </w:pPr>
+      <w:r>
+        <w:rPr>
+          <w:b/>
+          <w:bCs/>
+        </w:rPr>
+        <w:t>Como</w:t>
+      </w:r>
+      <w:r>
+        <w:t xml:space="preserve"> Cliente,</w:t>
+      </w:r>
+      <w:r>
+        <w:t xml:space="preserve"> </w:t>
+      </w:r>
+      <w:r>
+        <w:rPr>
+          <w:b/>
+          <w:bCs/>
+        </w:rPr>
+        <w:t>quiero</w:t>
+      </w:r>
+      <w:r>
+        <w:t xml:space="preserve"> consultar la información de los profesionales de belleza,</w:t>
+      </w:r>
+      <w:r>
+        <w:t xml:space="preserve"> </w:t>
+      </w:r>
+      <w:r>
+        <w:rPr>
+          <w:b/>
+          <w:bCs/>
+        </w:rPr>
+        <w:t>para</w:t>
+      </w:r>
+      <w:r>
+        <w:t xml:space="preserve"> conocer las opciones disponibles antes de solicitar un servicio.</w:t>
+      </w:r>
+    </w:p>
+    <w:p>
+      <w:pPr>
+        <w:spacing w:after="0"/>
+        <w:jc w:val="both"/>
+      </w:pPr>
+      <w:r>
+        <w:rPr>
+          <w:b/>
+          <w:bCs/>
+        </w:rPr>
+        <w:t>Relacionada con:</w:t>
+      </w:r>
+      <w:r>
+        <w:t xml:space="preserve"> RF-006.</w:t>
+      </w:r>
     </w:p>
     <w:p>
       <w:pPr>
@@ -4140,7 +4209,7 @@
           <w:bCs/>
         </w:rPr>
         <w:lastRenderedPageBreak/>
-        <w:t>HU-004 — Consulta de profesionales</w:t>
+        <w:t>HU-005 — Consulta de disponibilidad</w:t>
       </w:r>
     </w:p>
     <w:p>
@@ -4169,7 +4238,7 @@
         <w:t>quiero</w:t>
       </w:r>
       <w:r>
-        <w:t xml:space="preserve"> consultar la información de los profesionales de belleza,</w:t>
+        <w:t xml:space="preserve"> consultar la disponibilidad de los profesionales,</w:t>
       </w:r>
       <w:r>
         <w:t xml:space="preserve"> </w:t>
@@ -4182,7 +4251,7 @@
         <w:t>para</w:t>
       </w:r>
       <w:r>
-        <w:t xml:space="preserve"> conocer las opciones disponibles antes de solicitar un servicio.</w:t>
+        <w:t xml:space="preserve"> seleccionar una fecha y horario adecuados.</w:t>
       </w:r>
     </w:p>
     <w:p>
@@ -4198,24 +4267,24 @@
         <w:t>Relacionada con:</w:t>
       </w:r>
       <w:r>
-        <w:t xml:space="preserve"> RF-006.</w:t>
-      </w:r>
-    </w:p>
-    <w:p>
-      <w:pPr>
-        <w:spacing w:after="0"/>
-        <w:jc w:val="both"/>
-        <w:rPr>
-          <w:b/>
-          <w:bCs/>
-        </w:rPr>
-      </w:pPr>
-      <w:r>
-        <w:rPr>
-          <w:b/>
-          <w:bCs/>
-        </w:rPr>
-        <w:t>HU-005 — Consulta de disponibilidad</w:t>
+        <w:t xml:space="preserve"> RF-010.</w:t>
+      </w:r>
+    </w:p>
+    <w:p>
+      <w:pPr>
+        <w:spacing w:after="0"/>
+        <w:jc w:val="both"/>
+        <w:rPr>
+          <w:b/>
+          <w:bCs/>
+        </w:rPr>
+      </w:pPr>
+      <w:r>
+        <w:rPr>
+          <w:b/>
+          <w:bCs/>
+        </w:rPr>
+        <w:t>HU-006 — Solicitud de cita</w:t>
       </w:r>
     </w:p>
     <w:p>
@@ -4244,7 +4313,7 @@
         <w:t>quiero</w:t>
       </w:r>
       <w:r>
-        <w:t xml:space="preserve"> consultar la disponibilidad de los profesionales,</w:t>
+        <w:t xml:space="preserve"> solicitar una cita seleccionando el servicio, profesional, fecha y horario,</w:t>
       </w:r>
       <w:r>
         <w:t xml:space="preserve"> </w:t>
@@ -4257,7 +4326,7 @@
         <w:t>para</w:t>
       </w:r>
       <w:r>
-        <w:t xml:space="preserve"> seleccionar una fecha y horario adecuados.</w:t>
+        <w:t xml:space="preserve"> programar la prestación del servicio de belleza.</w:t>
       </w:r>
     </w:p>
     <w:p>
@@ -4273,24 +4342,24 @@
         <w:t>Relacionada con:</w:t>
       </w:r>
       <w:r>
-        <w:t xml:space="preserve"> RF-010.</w:t>
-      </w:r>
-    </w:p>
-    <w:p>
-      <w:pPr>
-        <w:spacing w:after="0"/>
-        <w:jc w:val="both"/>
-        <w:rPr>
-          <w:b/>
-          <w:bCs/>
-        </w:rPr>
-      </w:pPr>
-      <w:r>
-        <w:rPr>
-          <w:b/>
-          <w:bCs/>
-        </w:rPr>
-        <w:t>HU-006 — Solicitud de cita</w:t>
+        <w:t xml:space="preserve"> RF-011.</w:t>
+      </w:r>
+    </w:p>
+    <w:p>
+      <w:pPr>
+        <w:spacing w:after="0"/>
+        <w:jc w:val="both"/>
+        <w:rPr>
+          <w:b/>
+          <w:bCs/>
+        </w:rPr>
+      </w:pPr>
+      <w:r>
+        <w:rPr>
+          <w:b/>
+          <w:bCs/>
+        </w:rPr>
+        <w:t>HU-007 — Consulta de citas</w:t>
       </w:r>
     </w:p>
     <w:p>
@@ -4319,7 +4388,7 @@
         <w:t>quiero</w:t>
       </w:r>
       <w:r>
-        <w:t xml:space="preserve"> solicitar una cita seleccionando el servicio, profesional, fecha y horario,</w:t>
+        <w:t xml:space="preserve"> consultar mis citas registradas,</w:t>
       </w:r>
       <w:r>
         <w:t xml:space="preserve"> </w:t>
@@ -4332,7 +4401,7 @@
         <w:t>para</w:t>
       </w:r>
       <w:r>
-        <w:t xml:space="preserve"> programar la prestación del servicio de belleza.</w:t>
+        <w:t xml:space="preserve"> conocer y realizar seguimiento a mis servicios programados.</w:t>
       </w:r>
     </w:p>
     <w:p>
@@ -4348,24 +4417,24 @@
         <w:t>Relacionada con:</w:t>
       </w:r>
       <w:r>
-        <w:t xml:space="preserve"> RF-011.</w:t>
-      </w:r>
-    </w:p>
-    <w:p>
-      <w:pPr>
-        <w:spacing w:after="0"/>
-        <w:jc w:val="both"/>
-        <w:rPr>
-          <w:b/>
-          <w:bCs/>
-        </w:rPr>
-      </w:pPr>
-      <w:r>
-        <w:rPr>
-          <w:b/>
-          <w:bCs/>
-        </w:rPr>
-        <w:t>HU-007 — Consulta de citas</w:t>
+        <w:t xml:space="preserve"> RF-012.</w:t>
+      </w:r>
+    </w:p>
+    <w:p>
+      <w:pPr>
+        <w:spacing w:after="0"/>
+        <w:jc w:val="both"/>
+        <w:rPr>
+          <w:b/>
+          <w:bCs/>
+        </w:rPr>
+      </w:pPr>
+      <w:r>
+        <w:rPr>
+          <w:b/>
+          <w:bCs/>
+        </w:rPr>
+        <w:t>HU-008 — Información de pagos</w:t>
       </w:r>
     </w:p>
     <w:p>
@@ -4394,7 +4463,7 @@
         <w:t>quiero</w:t>
       </w:r>
       <w:r>
-        <w:t xml:space="preserve"> consultar mis citas registradas,</w:t>
+        <w:t xml:space="preserve"> consultar la información relacionada con los pagos de mis servicios,</w:t>
       </w:r>
       <w:r>
         <w:t xml:space="preserve"> </w:t>
@@ -4407,7 +4476,7 @@
         <w:t>para</w:t>
       </w:r>
       <w:r>
-        <w:t xml:space="preserve"> conocer y realizar seguimiento a mis servicios programados.</w:t>
+        <w:t xml:space="preserve"> conocer el estado de las operaciones asociadas a mis citas.</w:t>
       </w:r>
     </w:p>
     <w:p>
@@ -4423,6 +4492,339 @@
         <w:t>Relacionada con:</w:t>
       </w:r>
       <w:r>
+        <w:t xml:space="preserve"> RF-014.</w:t>
+      </w:r>
+    </w:p>
+    <w:p>
+      <w:pPr>
+        <w:spacing w:after="0"/>
+        <w:jc w:val="both"/>
+      </w:pPr>
+    </w:p>
+    <w:p>
+      <w:pPr>
+        <w:spacing w:after="0"/>
+        <w:jc w:val="both"/>
+        <w:rPr>
+          <w:b/>
+          <w:bCs/>
+        </w:rPr>
+      </w:pPr>
+      <w:r>
+        <w:rPr>
+          <w:b/>
+          <w:bCs/>
+        </w:rPr>
+        <w:t>3.7.2 Historias de usuario del Estilista</w:t>
+      </w:r>
+    </w:p>
+    <w:p>
+      <w:pPr>
+        <w:spacing w:after="0"/>
+        <w:jc w:val="both"/>
+        <w:rPr>
+          <w:b/>
+          <w:bCs/>
+        </w:rPr>
+      </w:pPr>
+      <w:r>
+        <w:rPr>
+          <w:b/>
+          <w:bCs/>
+        </w:rPr>
+        <w:t>HU-009 — Registro de estilista</w:t>
+      </w:r>
+    </w:p>
+    <w:p>
+      <w:pPr>
+        <w:spacing w:after="0"/>
+        <w:jc w:val="both"/>
+      </w:pPr>
+      <w:r>
+        <w:rPr>
+          <w:b/>
+          <w:bCs/>
+        </w:rPr>
+        <w:t>Como</w:t>
+      </w:r>
+      <w:r>
+        <w:t xml:space="preserve"> Estilista,</w:t>
+      </w:r>
+      <w:r>
+        <w:t xml:space="preserve"> </w:t>
+      </w:r>
+      <w:r>
+        <w:rPr>
+          <w:b/>
+          <w:bCs/>
+        </w:rPr>
+        <w:t>quiero</w:t>
+      </w:r>
+      <w:r>
+        <w:t xml:space="preserve"> registrarme en </w:t>
+      </w:r>
+      <w:r>
+        <w:rPr>
+          <w:b/>
+          <w:bCs/>
+        </w:rPr>
+        <w:t>YENJO 1.0</w:t>
+      </w:r>
+      <w:r>
+        <w:t>,</w:t>
+      </w:r>
+      <w:r>
+        <w:t xml:space="preserve"> </w:t>
+      </w:r>
+      <w:r>
+        <w:rPr>
+          <w:b/>
+          <w:bCs/>
+        </w:rPr>
+        <w:t>para</w:t>
+      </w:r>
+      <w:r>
+        <w:t xml:space="preserve"> disponer de una cuenta que me permita utilizar las funcionalidades correspondientes a mi rol.</w:t>
+      </w:r>
+    </w:p>
+    <w:p>
+      <w:pPr>
+        <w:spacing w:after="0"/>
+        <w:jc w:val="both"/>
+      </w:pPr>
+      <w:r>
+        <w:rPr>
+          <w:b/>
+          <w:bCs/>
+        </w:rPr>
+        <w:t>Relacionada con:</w:t>
+      </w:r>
+      <w:r>
+        <w:t xml:space="preserve"> RF-001.</w:t>
+      </w:r>
+    </w:p>
+    <w:p>
+      <w:pPr>
+        <w:spacing w:after="0"/>
+        <w:jc w:val="both"/>
+        <w:rPr>
+          <w:b/>
+          <w:bCs/>
+        </w:rPr>
+      </w:pPr>
+      <w:r>
+        <w:rPr>
+          <w:b/>
+          <w:bCs/>
+        </w:rPr>
+        <w:t>HU-010 — Gestión del perfil profesional</w:t>
+      </w:r>
+    </w:p>
+    <w:p>
+      <w:pPr>
+        <w:spacing w:after="0"/>
+        <w:jc w:val="both"/>
+      </w:pPr>
+      <w:r>
+        <w:rPr>
+          <w:b/>
+          <w:bCs/>
+        </w:rPr>
+        <w:t>Como</w:t>
+      </w:r>
+      <w:r>
+        <w:t xml:space="preserve"> Estilista,</w:t>
+      </w:r>
+      <w:r>
+        <w:t xml:space="preserve"> </w:t>
+      </w:r>
+      <w:r>
+        <w:rPr>
+          <w:b/>
+          <w:bCs/>
+        </w:rPr>
+        <w:t>quiero</w:t>
+      </w:r>
+      <w:r>
+        <w:t xml:space="preserve"> gestionar mi información profesional,</w:t>
+      </w:r>
+      <w:r>
+        <w:t xml:space="preserve"> </w:t>
+      </w:r>
+      <w:r>
+        <w:rPr>
+          <w:b/>
+          <w:bCs/>
+        </w:rPr>
+        <w:t>para</w:t>
+      </w:r>
+      <w:r>
+        <w:t xml:space="preserve"> mantener actualizados los datos que pueden consultar los clientes.</w:t>
+      </w:r>
+    </w:p>
+    <w:p>
+      <w:pPr>
+        <w:spacing w:after="0"/>
+        <w:jc w:val="both"/>
+      </w:pPr>
+      <w:r>
+        <w:rPr>
+          <w:b/>
+          <w:bCs/>
+        </w:rPr>
+        <w:t>Relacionada con:</w:t>
+      </w:r>
+      <w:r>
+        <w:t xml:space="preserve"> RF-007.</w:t>
+      </w:r>
+    </w:p>
+    <w:p>
+      <w:pPr>
+        <w:spacing w:after="0"/>
+        <w:jc w:val="both"/>
+        <w:rPr>
+          <w:b/>
+          <w:bCs/>
+        </w:rPr>
+      </w:pPr>
+      <w:r>
+        <w:rPr>
+          <w:b/>
+          <w:bCs/>
+        </w:rPr>
+        <w:t>HU-011 — Gestión de disponibilidad</w:t>
+      </w:r>
+    </w:p>
+    <w:p>
+      <w:pPr>
+        <w:spacing w:after="0"/>
+        <w:jc w:val="both"/>
+      </w:pPr>
+      <w:r>
+        <w:rPr>
+          <w:b/>
+          <w:bCs/>
+        </w:rPr>
+        <w:t>Como</w:t>
+      </w:r>
+      <w:r>
+        <w:t xml:space="preserve"> Estilista,</w:t>
+      </w:r>
+      <w:r>
+        <w:t xml:space="preserve"> </w:t>
+      </w:r>
+      <w:r>
+        <w:rPr>
+          <w:b/>
+          <w:bCs/>
+        </w:rPr>
+        <w:t>quiero</w:t>
+      </w:r>
+      <w:r>
+        <w:t xml:space="preserve"> registrar y gestionar mi disponibilidad,</w:t>
+      </w:r>
+      <w:r>
+        <w:t xml:space="preserve"> </w:t>
+      </w:r>
+      <w:r>
+        <w:rPr>
+          <w:b/>
+          <w:bCs/>
+        </w:rPr>
+        <w:t>para</w:t>
+      </w:r>
+      <w:r>
+        <w:t xml:space="preserve"> indicar los horarios en los que puedo prestar mis servicios.</w:t>
+      </w:r>
+    </w:p>
+    <w:p>
+      <w:pPr>
+        <w:spacing w:after="0"/>
+        <w:jc w:val="both"/>
+      </w:pPr>
+      <w:r>
+        <w:rPr>
+          <w:b/>
+          <w:bCs/>
+        </w:rPr>
+        <w:t>Relacionada con:</w:t>
+      </w:r>
+      <w:r>
+        <w:t xml:space="preserve"> RF-009.</w:t>
+      </w:r>
+    </w:p>
+    <w:p>
+      <w:pPr>
+        <w:spacing w:after="0"/>
+        <w:jc w:val="both"/>
+        <w:rPr>
+          <w:b/>
+          <w:bCs/>
+        </w:rPr>
+      </w:pPr>
+      <w:r>
+        <w:rPr>
+          <w:b/>
+          <w:bCs/>
+        </w:rPr>
+        <w:t>HU-012 — Consulta de citas</w:t>
+      </w:r>
+    </w:p>
+    <w:p>
+      <w:pPr>
+        <w:spacing w:after="0"/>
+        <w:jc w:val="both"/>
+      </w:pPr>
+      <w:r>
+        <w:rPr>
+          <w:b/>
+          <w:bCs/>
+        </w:rPr>
+        <w:t>Como</w:t>
+      </w:r>
+      <w:r>
+        <w:t xml:space="preserve"> Estilista,</w:t>
+      </w:r>
+      <w:r>
+        <w:t xml:space="preserve"> </w:t>
+      </w:r>
+      <w:r>
+        <w:rPr>
+          <w:b/>
+          <w:bCs/>
+        </w:rPr>
+        <w:t>quiero</w:t>
+      </w:r>
+      <w:r>
+        <w:t xml:space="preserve"> consultar las citas asociadas a mis servicios,</w:t>
+      </w:r>
+      <w:r>
+        <w:t xml:space="preserve"> </w:t>
+      </w:r>
+      <w:r>
+        <w:rPr>
+          <w:b/>
+          <w:bCs/>
+        </w:rPr>
+        <w:t>para</w:t>
+      </w:r>
+      <w:r>
+        <w:t xml:space="preserve"> organizar y realizar seguimiento a mi agenda.</w:t>
+      </w:r>
+    </w:p>
+    <w:p>
+      <w:pPr>
+        <w:spacing w:after="0"/>
+        <w:jc w:val="both"/>
+      </w:pPr>
+      <w:r>
+        <w:rPr>
+          <w:b/>
+          <w:bCs/>
+        </w:rPr>
+        <w:t>Relacionada con:</w:t>
+      </w:r>
+      <w:r>
         <w:t xml:space="preserve"> RF-012.</w:t>
       </w:r>
     </w:p>
@@ -4440,7 +4842,7 @@
           <w:b/>
           <w:bCs/>
         </w:rPr>
-        <w:t>HU-008 — Información de pagos</w:t>
+        <w:t>HU-013 — Gestión de servicios profesionales</w:t>
       </w:r>
     </w:p>
     <w:p>
@@ -4456,7 +4858,7 @@
         <w:t>Como</w:t>
       </w:r>
       <w:r>
-        <w:t xml:space="preserve"> Cliente,</w:t>
+        <w:t xml:space="preserve"> Estilista,</w:t>
       </w:r>
       <w:r>
         <w:t xml:space="preserve"> </w:t>
@@ -4469,7 +4871,7 @@
         <w:t>quiero</w:t>
       </w:r>
       <w:r>
-        <w:t xml:space="preserve"> consultar la información relacionada con los pagos de mis servicios,</w:t>
+        <w:t xml:space="preserve"> gestionar la información de los servicios que ofrezco, de acuerdo con los permisos asignados,</w:t>
       </w:r>
       <w:r>
         <w:t xml:space="preserve"> </w:t>
@@ -4482,7 +4884,7 @@
         <w:t>para</w:t>
       </w:r>
       <w:r>
-        <w:t xml:space="preserve"> conocer el estado de las operaciones asociadas a mis citas.</w:t>
+        <w:t xml:space="preserve"> mantener actualizada mi oferta de servicios.</w:t>
       </w:r>
     </w:p>
     <w:p>
@@ -4498,47 +4900,53 @@
         <w:t>Relacionada con:</w:t>
       </w:r>
       <w:r>
-        <w:t xml:space="preserve"> RF-014.</w:t>
-      </w:r>
-    </w:p>
-    <w:p>
-      <w:pPr>
-        <w:spacing w:after="0"/>
-        <w:jc w:val="both"/>
-      </w:pPr>
-    </w:p>
-    <w:p>
-      <w:pPr>
-        <w:spacing w:after="0"/>
-        <w:jc w:val="both"/>
-        <w:rPr>
-          <w:b/>
-          <w:bCs/>
-        </w:rPr>
-      </w:pPr>
-      <w:r>
-        <w:rPr>
-          <w:b/>
-          <w:bCs/>
-        </w:rPr>
-        <w:t>3.7.2 Historias de usuario del Estilista</w:t>
-      </w:r>
-    </w:p>
-    <w:p>
-      <w:pPr>
-        <w:spacing w:after="0"/>
-        <w:jc w:val="both"/>
-        <w:rPr>
-          <w:b/>
-          <w:bCs/>
-        </w:rPr>
-      </w:pPr>
-      <w:r>
-        <w:rPr>
-          <w:b/>
-          <w:bCs/>
-        </w:rPr>
-        <w:t>HU-009 — Registro de estilista</w:t>
+        <w:t xml:space="preserve"> RF-0</w:t>
+      </w:r>
+      <w:r>
+        <w:t>17</w:t>
+      </w:r>
+      <w:r>
+        <w:t>.</w:t>
+      </w:r>
+    </w:p>
+    <w:p>
+      <w:pPr>
+        <w:spacing w:after="0"/>
+        <w:jc w:val="both"/>
+      </w:pPr>
+    </w:p>
+    <w:p>
+      <w:pPr>
+        <w:spacing w:after="0"/>
+        <w:jc w:val="both"/>
+        <w:rPr>
+          <w:b/>
+          <w:bCs/>
+        </w:rPr>
+      </w:pPr>
+      <w:r>
+        <w:rPr>
+          <w:b/>
+          <w:bCs/>
+        </w:rPr>
+        <w:t>3.7.3 Historias de usuario del Administrador</w:t>
+      </w:r>
+    </w:p>
+    <w:p>
+      <w:pPr>
+        <w:spacing w:after="0"/>
+        <w:jc w:val="both"/>
+        <w:rPr>
+          <w:b/>
+          <w:bCs/>
+        </w:rPr>
+      </w:pPr>
+      <w:r>
+        <w:rPr>
+          <w:b/>
+          <w:bCs/>
+        </w:rPr>
+        <w:t>HU-014 — Inicio de sesión administrativo</w:t>
       </w:r>
     </w:p>
     <w:p>
@@ -4554,7 +4962,7 @@
         <w:t>Como</w:t>
       </w:r>
       <w:r>
-        <w:t xml:space="preserve"> Estilista,</w:t>
+        <w:t xml:space="preserve"> Administrador,</w:t>
       </w:r>
       <w:r>
         <w:t xml:space="preserve"> </w:t>
@@ -4567,17 +4975,7 @@
         <w:t>quiero</w:t>
       </w:r>
       <w:r>
-        <w:t xml:space="preserve"> registrarme en </w:t>
-      </w:r>
-      <w:r>
-        <w:rPr>
-          <w:b/>
-          <w:bCs/>
-        </w:rPr>
-        <w:t>YENJO 1.0</w:t>
-      </w:r>
-      <w:r>
-        <w:t>,</w:t>
+        <w:t xml:space="preserve"> iniciar sesión de manera segura,</w:t>
       </w:r>
       <w:r>
         <w:t xml:space="preserve"> </w:t>
@@ -4590,7 +4988,7 @@
         <w:t>para</w:t>
       </w:r>
       <w:r>
-        <w:t xml:space="preserve"> disponer de una cuenta que me permita utilizar las funcionalidades correspondientes a mi rol.</w:t>
+        <w:t xml:space="preserve"> acceder a las funcionalidades administrativas del sistema.</w:t>
       </w:r>
     </w:p>
     <w:p>
@@ -4606,320 +5004,8 @@
         <w:t>Relacionada con:</w:t>
       </w:r>
       <w:r>
-        <w:t xml:space="preserve"> RF-001.</w:t>
-      </w:r>
-    </w:p>
-    <w:p>
-      <w:pPr>
-        <w:spacing w:after="0"/>
-        <w:jc w:val="both"/>
-        <w:rPr>
-          <w:b/>
-          <w:bCs/>
-        </w:rPr>
-      </w:pPr>
-      <w:r>
-        <w:rPr>
-          <w:b/>
-          <w:bCs/>
-        </w:rPr>
-        <w:t>HU-010 — Gestión del perfil profesional</w:t>
-      </w:r>
-    </w:p>
-    <w:p>
-      <w:pPr>
-        <w:spacing w:after="0"/>
-        <w:jc w:val="both"/>
-      </w:pPr>
-      <w:r>
-        <w:rPr>
-          <w:b/>
-          <w:bCs/>
-        </w:rPr>
-        <w:t>Como</w:t>
-      </w:r>
-      <w:r>
-        <w:t xml:space="preserve"> Estilista,</w:t>
-      </w:r>
-      <w:r>
-        <w:t xml:space="preserve"> </w:t>
-      </w:r>
-      <w:r>
-        <w:rPr>
-          <w:b/>
-          <w:bCs/>
-        </w:rPr>
-        <w:t>quiero</w:t>
-      </w:r>
-      <w:r>
-        <w:t xml:space="preserve"> gestionar mi información profesional,</w:t>
-      </w:r>
-      <w:r>
-        <w:t xml:space="preserve"> </w:t>
-      </w:r>
-      <w:r>
-        <w:rPr>
-          <w:b/>
-          <w:bCs/>
-        </w:rPr>
-        <w:t>para</w:t>
-      </w:r>
-      <w:r>
-        <w:t xml:space="preserve"> mantener actualizados los datos que pueden consultar los clientes.</w:t>
-      </w:r>
-    </w:p>
-    <w:p>
-      <w:pPr>
-        <w:spacing w:after="0"/>
-        <w:jc w:val="both"/>
-      </w:pPr>
-      <w:r>
-        <w:rPr>
-          <w:b/>
-          <w:bCs/>
-        </w:rPr>
-        <w:t>Relacionada con:</w:t>
-      </w:r>
-      <w:r>
-        <w:t xml:space="preserve"> RF-007.</w:t>
-      </w:r>
-    </w:p>
-    <w:p>
-      <w:pPr>
-        <w:spacing w:after="0"/>
-        <w:jc w:val="both"/>
-        <w:rPr>
-          <w:b/>
-          <w:bCs/>
-        </w:rPr>
-      </w:pPr>
-      <w:r>
-        <w:rPr>
-          <w:b/>
-          <w:bCs/>
-        </w:rPr>
-        <w:t>HU-011 — Gestión de disponibilidad</w:t>
-      </w:r>
-    </w:p>
-    <w:p>
-      <w:pPr>
-        <w:spacing w:after="0"/>
-        <w:jc w:val="both"/>
-      </w:pPr>
-      <w:r>
-        <w:rPr>
-          <w:b/>
-          <w:bCs/>
-        </w:rPr>
-        <w:t>Como</w:t>
-      </w:r>
-      <w:r>
-        <w:t xml:space="preserve"> Estilista,</w:t>
-      </w:r>
-      <w:r>
-        <w:t xml:space="preserve"> </w:t>
-      </w:r>
-      <w:r>
-        <w:rPr>
-          <w:b/>
-          <w:bCs/>
-        </w:rPr>
-        <w:t>quiero</w:t>
-      </w:r>
-      <w:r>
-        <w:t xml:space="preserve"> registrar y gestionar mi disponibilidad,</w:t>
-      </w:r>
-      <w:r>
-        <w:t xml:space="preserve"> </w:t>
-      </w:r>
-      <w:r>
-        <w:rPr>
-          <w:b/>
-          <w:bCs/>
-        </w:rPr>
-        <w:t>para</w:t>
-      </w:r>
-      <w:r>
-        <w:t xml:space="preserve"> indicar los horarios en los que puedo prestar mis servicios.</w:t>
-      </w:r>
-    </w:p>
-    <w:p>
-      <w:pPr>
-        <w:spacing w:after="0"/>
-        <w:jc w:val="both"/>
-      </w:pPr>
-      <w:r>
-        <w:rPr>
-          <w:b/>
-          <w:bCs/>
-        </w:rPr>
-        <w:t>Relacionada con:</w:t>
-      </w:r>
-      <w:r>
-        <w:t xml:space="preserve"> RF-009.</w:t>
-      </w:r>
-    </w:p>
-    <w:p>
-      <w:pPr>
-        <w:spacing w:after="0"/>
-        <w:jc w:val="both"/>
-        <w:rPr>
-          <w:b/>
-          <w:bCs/>
-        </w:rPr>
-      </w:pPr>
-      <w:r>
-        <w:rPr>
-          <w:b/>
-          <w:bCs/>
-        </w:rPr>
-        <w:t>HU-012 — Consulta de citas</w:t>
-      </w:r>
-    </w:p>
-    <w:p>
-      <w:pPr>
-        <w:spacing w:after="0"/>
-        <w:jc w:val="both"/>
-      </w:pPr>
-      <w:r>
-        <w:rPr>
-          <w:b/>
-          <w:bCs/>
-        </w:rPr>
-        <w:t>Como</w:t>
-      </w:r>
-      <w:r>
-        <w:t xml:space="preserve"> Estilista,</w:t>
-      </w:r>
-      <w:r>
-        <w:t xml:space="preserve"> </w:t>
-      </w:r>
-      <w:r>
-        <w:rPr>
-          <w:b/>
-          <w:bCs/>
-        </w:rPr>
-        <w:t>quiero</w:t>
-      </w:r>
-      <w:r>
-        <w:t xml:space="preserve"> consultar las citas asociadas a mis servicios,</w:t>
-      </w:r>
-      <w:r>
-        <w:t xml:space="preserve"> </w:t>
-      </w:r>
-      <w:r>
-        <w:rPr>
-          <w:b/>
-          <w:bCs/>
-        </w:rPr>
-        <w:t>para</w:t>
-      </w:r>
-      <w:r>
-        <w:t xml:space="preserve"> organizar y realizar seguimiento a mi agenda.</w:t>
-      </w:r>
-    </w:p>
-    <w:p>
-      <w:pPr>
-        <w:spacing w:after="0"/>
-        <w:jc w:val="both"/>
-      </w:pPr>
-      <w:r>
-        <w:rPr>
-          <w:b/>
-          <w:bCs/>
-        </w:rPr>
-        <w:t>Relacionada con:</w:t>
-      </w:r>
-      <w:r>
-        <w:t xml:space="preserve"> RF-012.</w:t>
-      </w:r>
-    </w:p>
-    <w:p>
-      <w:pPr>
-        <w:spacing w:after="0"/>
-        <w:jc w:val="both"/>
-        <w:rPr>
-          <w:b/>
-          <w:bCs/>
-        </w:rPr>
-      </w:pPr>
-      <w:r>
-        <w:rPr>
-          <w:b/>
-          <w:bCs/>
-        </w:rPr>
-        <w:t>HU-013 — Gestión de servicios profesionales</w:t>
-      </w:r>
-    </w:p>
-    <w:p>
-      <w:pPr>
-        <w:spacing w:after="0"/>
-        <w:jc w:val="both"/>
-      </w:pPr>
-      <w:r>
-        <w:rPr>
-          <w:b/>
-          <w:bCs/>
-        </w:rPr>
-        <w:t>Como</w:t>
-      </w:r>
-      <w:r>
-        <w:t xml:space="preserve"> Estilista,</w:t>
-      </w:r>
-      <w:r>
-        <w:t xml:space="preserve"> </w:t>
-      </w:r>
-      <w:r>
-        <w:rPr>
-          <w:b/>
-          <w:bCs/>
-        </w:rPr>
-        <w:t>quiero</w:t>
-      </w:r>
-      <w:r>
-        <w:t xml:space="preserve"> gestionar la información de los servicios que ofrezco, de acuerdo con los permisos asignados,</w:t>
-      </w:r>
-      <w:r>
-        <w:t xml:space="preserve"> </w:t>
-      </w:r>
-      <w:r>
-        <w:rPr>
-          <w:b/>
-          <w:bCs/>
-        </w:rPr>
-        <w:t>para</w:t>
-      </w:r>
-      <w:r>
-        <w:t xml:space="preserve"> mantener actualizada mi oferta de servicios.</w:t>
-      </w:r>
-    </w:p>
-    <w:p>
-      <w:pPr>
-        <w:spacing w:after="0"/>
-        <w:jc w:val="both"/>
-      </w:pPr>
-      <w:r>
-        <w:rPr>
-          <w:b/>
-          <w:bCs/>
-        </w:rPr>
-        <w:t>Relacionada con:</w:t>
-      </w:r>
-      <w:r>
-        <w:t xml:space="preserve"> RF-004 / RF-007.</w:t>
-      </w:r>
-    </w:p>
-    <w:p>
-      <w:pPr>
-        <w:spacing w:after="0"/>
-        <w:jc w:val="both"/>
-      </w:pPr>
-    </w:p>
-    <w:p>
-      <w:pPr>
-        <w:spacing w:after="0"/>
-        <w:jc w:val="both"/>
-      </w:pPr>
+        <w:t xml:space="preserve"> RF-002.</w:t>
+      </w:r>
     </w:p>
     <w:p>
       <w:pPr>
@@ -4936,98 +5022,6 @@
           <w:bCs/>
         </w:rPr>
         <w:lastRenderedPageBreak/>
-        <w:t>3.7.3 Historias de usuario del Administrador</w:t>
-      </w:r>
-    </w:p>
-    <w:p>
-      <w:pPr>
-        <w:spacing w:after="0"/>
-        <w:jc w:val="both"/>
-        <w:rPr>
-          <w:b/>
-          <w:bCs/>
-        </w:rPr>
-      </w:pPr>
-      <w:r>
-        <w:rPr>
-          <w:b/>
-          <w:bCs/>
-        </w:rPr>
-        <w:t>HU-014 — Inicio de sesión administrativo</w:t>
-      </w:r>
-    </w:p>
-    <w:p>
-      <w:pPr>
-        <w:spacing w:after="0"/>
-        <w:jc w:val="both"/>
-      </w:pPr>
-      <w:r>
-        <w:rPr>
-          <w:b/>
-          <w:bCs/>
-        </w:rPr>
-        <w:t>Como</w:t>
-      </w:r>
-      <w:r>
-        <w:t xml:space="preserve"> Administrador,</w:t>
-      </w:r>
-      <w:r>
-        <w:t xml:space="preserve"> </w:t>
-      </w:r>
-      <w:r>
-        <w:rPr>
-          <w:b/>
-          <w:bCs/>
-        </w:rPr>
-        <w:t>quiero</w:t>
-      </w:r>
-      <w:r>
-        <w:t xml:space="preserve"> iniciar sesión de manera segura,</w:t>
-      </w:r>
-      <w:r>
-        <w:t xml:space="preserve"> </w:t>
-      </w:r>
-      <w:r>
-        <w:rPr>
-          <w:b/>
-          <w:bCs/>
-        </w:rPr>
-        <w:t>para</w:t>
-      </w:r>
-      <w:r>
-        <w:t xml:space="preserve"> acceder a las funcionalidades administrativas del sistema.</w:t>
-      </w:r>
-    </w:p>
-    <w:p>
-      <w:pPr>
-        <w:spacing w:after="0"/>
-        <w:jc w:val="both"/>
-      </w:pPr>
-      <w:r>
-        <w:rPr>
-          <w:b/>
-          <w:bCs/>
-        </w:rPr>
-        <w:t>Relacionada con:</w:t>
-      </w:r>
-      <w:r>
-        <w:t xml:space="preserve"> RF-002.</w:t>
-      </w:r>
-    </w:p>
-    <w:p>
-      <w:pPr>
-        <w:spacing w:after="0"/>
-        <w:jc w:val="both"/>
-        <w:rPr>
-          <w:b/>
-          <w:bCs/>
-        </w:rPr>
-      </w:pPr>
-      <w:r>
-        <w:rPr>
-          <w:b/>
-          <w:bCs/>
-        </w:rPr>
         <w:t>HU-015 — Gestión de usuarios y roles</w:t>
       </w:r>
     </w:p>
@@ -5686,6 +5680,58 @@
           <w:szCs w:val="28"/>
         </w:rPr>
       </w:pPr>
+    </w:p>
+    <w:p>
+      <w:pPr>
+        <w:spacing w:after="0"/>
+        <w:jc w:val="both"/>
+        <w:rPr>
+          <w:rFonts w:cstheme="minorHAnsi"/>
+          <w:b/>
+          <w:bCs/>
+          <w:sz w:val="28"/>
+          <w:szCs w:val="28"/>
+        </w:rPr>
+      </w:pPr>
+    </w:p>
+    <w:p>
+      <w:pPr>
+        <w:spacing w:after="0"/>
+        <w:jc w:val="both"/>
+        <w:rPr>
+          <w:rFonts w:cstheme="minorHAnsi"/>
+          <w:b/>
+          <w:bCs/>
+          <w:sz w:val="28"/>
+          <w:szCs w:val="28"/>
+        </w:rPr>
+      </w:pPr>
+    </w:p>
+    <w:p>
+      <w:pPr>
+        <w:spacing w:after="0"/>
+        <w:jc w:val="both"/>
+        <w:rPr>
+          <w:rFonts w:cstheme="minorHAnsi"/>
+          <w:b/>
+          <w:bCs/>
+          <w:sz w:val="28"/>
+          <w:szCs w:val="28"/>
+        </w:rPr>
+      </w:pPr>
+    </w:p>
+    <w:p>
+      <w:pPr>
+        <w:spacing w:after="0"/>
+        <w:jc w:val="both"/>
+        <w:rPr>
+          <w:rFonts w:cstheme="minorHAnsi"/>
+          <w:b/>
+          <w:bCs/>
+          <w:sz w:val="28"/>
+          <w:szCs w:val="28"/>
+        </w:rPr>
+      </w:pPr>
       <w:r>
         <w:rPr>
           <w:rFonts w:cstheme="minorHAnsi"/>
@@ -8041,7 +8087,19 @@
         <w:rPr>
           <w:rFonts w:cstheme="minorHAnsi"/>
         </w:rPr>
-        <w:t>El Cliente interactúa principalmente con las funcionalidades relacionadas con la consulta de servicios y profesionales, gestión de disponibilidad, solicitud y consulta de citas y consulta de información relacionada con pagos.</w:t>
+        <w:t xml:space="preserve">El Cliente interactúa principalmente con las funcionalidades relacionadas con la consulta de servicios y profesionales, </w:t>
+      </w:r>
+      <w:r>
+        <w:rPr>
+          <w:rFonts w:cstheme="minorHAnsi"/>
+        </w:rPr>
+        <w:t>consulta</w:t>
+      </w:r>
+      <w:r>
+        <w:rPr>
+          <w:rFonts w:cstheme="minorHAnsi"/>
+        </w:rPr>
+        <w:t xml:space="preserve"> de disponibilidad, solicitud y consulta de citas y consulta de información relacionada con pagos.</w:t>
       </w:r>
     </w:p>
     <w:p>
@@ -8142,16 +8200,19 @@
         <w:jc w:val="both"/>
       </w:pPr>
       <w:r>
+        <w:rPr>
+          <w:noProof/>
+        </w:rPr>
         <w:drawing>
-          <wp:anchor distT="0" distB="0" distL="114300" distR="114300" simplePos="0" relativeHeight="251662336" behindDoc="1" locked="0" layoutInCell="1" allowOverlap="1" wp14:anchorId="24BA1CD3" wp14:editId="74CAB65E">
+          <wp:anchor distT="0" distB="0" distL="114300" distR="114300" simplePos="0" relativeHeight="251662336" behindDoc="1" locked="0" layoutInCell="1" allowOverlap="1" wp14:anchorId="24BA1CD3" wp14:editId="2925FE65">
             <wp:simplePos x="0" y="0"/>
             <wp:positionH relativeFrom="column">
               <wp:posOffset>-3810</wp:posOffset>
             </wp:positionH>
             <wp:positionV relativeFrom="paragraph">
-              <wp:posOffset>11430</wp:posOffset>
+              <wp:posOffset>10795</wp:posOffset>
             </wp:positionV>
-            <wp:extent cx="3952875" cy="1743075"/>
+            <wp:extent cx="4848225" cy="1743075"/>
             <wp:effectExtent l="0" t="0" r="9525" b="9525"/>
             <wp:wrapNone/>
             <wp:docPr id="5" name="Imagen 5"/>
@@ -8183,7 +8244,7 @@
                   <pic:spPr bwMode="auto">
                     <a:xfrm>
                       <a:off x="0" y="0"/>
-                      <a:ext cx="3952875" cy="1743075"/>
+                      <a:ext cx="4848225" cy="1743075"/>
                     </a:xfrm>
                     <a:prstGeom prst="rect">
                       <a:avLst/>
@@ -8411,36 +8472,31 @@
           <w:sz w:val="20"/>
           <w:szCs w:val="20"/>
         </w:rPr>
-        <w:t xml:space="preserve">(CU) </w:t>
-      </w:r>
-      <w:r>
-        <w:rPr>
-          <w:rFonts w:ascii="Arial Black" w:hAnsi="Arial Black"/>
-          <w:sz w:val="20"/>
-          <w:szCs w:val="20"/>
-        </w:rPr>
-        <w:t>del estilista</w:t>
-      </w:r>
-    </w:p>
-    <w:p>
-      <w:pPr>
-        <w:spacing w:after="0"/>
-        <w:jc w:val="both"/>
-        <w:rPr>
-          <w:rFonts w:cstheme="minorHAnsi"/>
-        </w:rPr>
-      </w:pPr>
-      <w:r>
+        <w:t>(CU) del estilista</w:t>
+      </w:r>
+    </w:p>
+    <w:p>
+      <w:pPr>
+        <w:spacing w:after="0"/>
+        <w:jc w:val="both"/>
+        <w:rPr>
+          <w:rFonts w:cstheme="minorHAnsi"/>
+        </w:rPr>
+      </w:pPr>
+      <w:r>
+        <w:rPr>
+          <w:noProof/>
+        </w:rPr>
         <w:drawing>
-          <wp:anchor distT="0" distB="0" distL="114300" distR="114300" simplePos="0" relativeHeight="251663360" behindDoc="1" locked="0" layoutInCell="1" allowOverlap="1" wp14:anchorId="432C3A10" wp14:editId="4A1A8BBC">
+          <wp:anchor distT="0" distB="0" distL="114300" distR="114300" simplePos="0" relativeHeight="251663360" behindDoc="1" locked="0" layoutInCell="1" allowOverlap="1" wp14:anchorId="432C3A10" wp14:editId="2759D45C">
             <wp:simplePos x="0" y="0"/>
             <wp:positionH relativeFrom="column">
               <wp:posOffset>-3810</wp:posOffset>
             </wp:positionH>
             <wp:positionV relativeFrom="paragraph">
-              <wp:posOffset>71120</wp:posOffset>
+              <wp:posOffset>66675</wp:posOffset>
             </wp:positionV>
-            <wp:extent cx="3952875" cy="1419225"/>
+            <wp:extent cx="4848225" cy="1419225"/>
             <wp:effectExtent l="0" t="0" r="9525" b="9525"/>
             <wp:wrapNone/>
             <wp:docPr id="6" name="Imagen 6"/>
@@ -8472,7 +8528,7 @@
                   <pic:spPr bwMode="auto">
                     <a:xfrm>
                       <a:off x="0" y="0"/>
-                      <a:ext cx="3952875" cy="1419225"/>
+                      <a:ext cx="4848225" cy="1419225"/>
                     </a:xfrm>
                     <a:prstGeom prst="rect">
                       <a:avLst/>
@@ -8652,16 +8708,19 @@
         </w:rPr>
       </w:pPr>
       <w:r>
+        <w:rPr>
+          <w:noProof/>
+        </w:rPr>
         <w:drawing>
-          <wp:anchor distT="0" distB="0" distL="114300" distR="114300" simplePos="0" relativeHeight="251664384" behindDoc="1" locked="0" layoutInCell="1" allowOverlap="1" wp14:anchorId="62F06E46" wp14:editId="582D4877">
+          <wp:anchor distT="0" distB="0" distL="114300" distR="114300" simplePos="0" relativeHeight="251664384" behindDoc="1" locked="0" layoutInCell="1" allowOverlap="1" wp14:anchorId="62F06E46" wp14:editId="46BCF4D8">
             <wp:simplePos x="0" y="0"/>
             <wp:positionH relativeFrom="column">
               <wp:posOffset>-3810</wp:posOffset>
             </wp:positionH>
             <wp:positionV relativeFrom="paragraph">
-              <wp:posOffset>31115</wp:posOffset>
+              <wp:posOffset>27940</wp:posOffset>
             </wp:positionV>
-            <wp:extent cx="3971925" cy="1533525"/>
+            <wp:extent cx="4829175" cy="1533525"/>
             <wp:effectExtent l="0" t="0" r="9525" b="9525"/>
             <wp:wrapNone/>
             <wp:docPr id="7" name="Imagen 7"/>
@@ -8693,7 +8752,7 @@
                   <pic:spPr bwMode="auto">
                     <a:xfrm>
                       <a:off x="0" y="0"/>
-                      <a:ext cx="3971925" cy="1533525"/>
+                      <a:ext cx="4829175" cy="1533525"/>
                     </a:xfrm>
                     <a:prstGeom prst="rect">
                       <a:avLst/>
@@ -8853,23 +8912,7 @@
           <w:sz w:val="20"/>
           <w:szCs w:val="20"/>
         </w:rPr>
-        <w:t>Tabla 3.</w:t>
-      </w:r>
-      <w:r>
-        <w:rPr>
-          <w:rFonts w:ascii="Arial Black" w:hAnsi="Arial Black" w:cstheme="minorHAnsi"/>
-          <w:sz w:val="20"/>
-          <w:szCs w:val="20"/>
-        </w:rPr>
-        <w:t>7</w:t>
-      </w:r>
-      <w:r>
-        <w:rPr>
-          <w:rFonts w:ascii="Arial Black" w:hAnsi="Arial Black" w:cstheme="minorHAnsi"/>
-          <w:sz w:val="20"/>
-          <w:szCs w:val="20"/>
-        </w:rPr>
-        <w:t xml:space="preserve"> </w:t>
+        <w:t xml:space="preserve">Tabla 3.7 </w:t>
       </w:r>
       <w:r>
         <w:rPr>
@@ -8929,19 +8972,22 @@
         </w:rPr>
       </w:pPr>
       <w:r>
+        <w:rPr>
+          <w:noProof/>
+        </w:rPr>
         <w:drawing>
-          <wp:anchor distT="0" distB="0" distL="114300" distR="114300" simplePos="0" relativeHeight="251665408" behindDoc="1" locked="0" layoutInCell="1" allowOverlap="1" wp14:anchorId="6A3BDAB4" wp14:editId="55C0CC41">
+          <wp:anchor distT="0" distB="0" distL="114300" distR="114300" simplePos="0" relativeHeight="251670528" behindDoc="1" locked="0" layoutInCell="1" allowOverlap="1" wp14:anchorId="4A34C7AF" wp14:editId="4F5182A2">
             <wp:simplePos x="0" y="0"/>
             <wp:positionH relativeFrom="column">
               <wp:posOffset>-3810</wp:posOffset>
             </wp:positionH>
             <wp:positionV relativeFrom="paragraph">
-              <wp:posOffset>61595</wp:posOffset>
+              <wp:posOffset>20320</wp:posOffset>
             </wp:positionV>
-            <wp:extent cx="4019550" cy="1914525"/>
-            <wp:effectExtent l="0" t="0" r="0" b="9525"/>
+            <wp:extent cx="4829175" cy="2105025"/>
+            <wp:effectExtent l="0" t="0" r="9525" b="9525"/>
             <wp:wrapNone/>
-            <wp:docPr id="8" name="Imagen 8"/>
+            <wp:docPr id="13" name="Imagen 13"/>
             <wp:cNvGraphicFramePr>
               <a:graphicFrameLocks xmlns:a="http://schemas.openxmlformats.org/drawingml/2006/main" noChangeAspect="1"/>
             </wp:cNvGraphicFramePr>
@@ -8949,7 +8995,7 @@
               <a:graphicData uri="http://schemas.openxmlformats.org/drawingml/2006/picture">
                 <pic:pic xmlns:pic="http://schemas.openxmlformats.org/drawingml/2006/picture">
                   <pic:nvPicPr>
-                    <pic:cNvPr id="0" name="Picture 5"/>
+                    <pic:cNvPr id="0" name="Picture 3"/>
                     <pic:cNvPicPr>
                       <a:picLocks noChangeAspect="1" noChangeArrowheads="1"/>
                     </pic:cNvPicPr>
@@ -8970,7 +9016,7 @@
                   <pic:spPr bwMode="auto">
                     <a:xfrm>
                       <a:off x="0" y="0"/>
-                      <a:ext cx="4019550" cy="1914525"/>
+                      <a:ext cx="4829175" cy="2105025"/>
                     </a:xfrm>
                     <a:prstGeom prst="rect">
                       <a:avLst/>
@@ -9239,19 +9285,22 @@
       </w:pPr>
       <w:bookmarkStart w:id="1" w:name="_Hlk238243749"/>
       <w:r>
+        <w:rPr>
+          <w:noProof/>
+        </w:rPr>
         <w:drawing>
-          <wp:anchor distT="0" distB="0" distL="114300" distR="114300" simplePos="0" relativeHeight="251666432" behindDoc="1" locked="0" layoutInCell="1" allowOverlap="1" wp14:anchorId="0DB2B697" wp14:editId="410E0079">
+          <wp:anchor distT="0" distB="0" distL="114300" distR="114300" simplePos="0" relativeHeight="251671552" behindDoc="1" locked="0" layoutInCell="1" allowOverlap="1" wp14:anchorId="3622E5D9" wp14:editId="3D0BC23C">
             <wp:simplePos x="0" y="0"/>
             <wp:positionH relativeFrom="column">
               <wp:posOffset>-3810</wp:posOffset>
             </wp:positionH>
             <wp:positionV relativeFrom="paragraph">
-              <wp:posOffset>189229</wp:posOffset>
+              <wp:posOffset>189230</wp:posOffset>
             </wp:positionV>
-            <wp:extent cx="5612130" cy="2962275"/>
-            <wp:effectExtent l="0" t="0" r="7620" b="9525"/>
+            <wp:extent cx="5612130" cy="3352800"/>
+            <wp:effectExtent l="0" t="0" r="7620" b="0"/>
             <wp:wrapNone/>
-            <wp:docPr id="9" name="Imagen 9"/>
+            <wp:docPr id="14" name="Imagen 14"/>
             <wp:cNvGraphicFramePr>
               <a:graphicFrameLocks xmlns:a="http://schemas.openxmlformats.org/drawingml/2006/main" noChangeAspect="1"/>
             </wp:cNvGraphicFramePr>
@@ -9259,7 +9308,7 @@
               <a:graphicData uri="http://schemas.openxmlformats.org/drawingml/2006/picture">
                 <pic:pic xmlns:pic="http://schemas.openxmlformats.org/drawingml/2006/picture">
                   <pic:nvPicPr>
-                    <pic:cNvPr id="0" name="Picture 6"/>
+                    <pic:cNvPr id="0" name="Picture 4"/>
                     <pic:cNvPicPr>
                       <a:picLocks noChangeAspect="1" noChangeArrowheads="1"/>
                     </pic:cNvPicPr>
@@ -9280,7 +9329,7 @@
                   <pic:spPr bwMode="auto">
                     <a:xfrm>
                       <a:off x="0" y="0"/>
-                      <a:ext cx="5612130" cy="2962275"/>
+                      <a:ext cx="5612130" cy="3352800"/>
                     </a:xfrm>
                     <a:prstGeom prst="rect">
                       <a:avLst/>
@@ -9484,6 +9533,28 @@
           <w:bCs/>
         </w:rPr>
       </w:pPr>
+    </w:p>
+    <w:p>
+      <w:pPr>
+        <w:spacing w:after="0"/>
+        <w:jc w:val="both"/>
+        <w:rPr>
+          <w:rFonts w:cstheme="minorHAnsi"/>
+          <w:b/>
+          <w:bCs/>
+        </w:rPr>
+      </w:pPr>
+    </w:p>
+    <w:p>
+      <w:pPr>
+        <w:spacing w:after="0"/>
+        <w:jc w:val="both"/>
+        <w:rPr>
+          <w:rFonts w:cstheme="minorHAnsi"/>
+          <w:b/>
+          <w:bCs/>
+        </w:rPr>
+      </w:pPr>
       <w:r>
         <w:rPr>
           <w:rFonts w:cstheme="minorHAnsi"/>
@@ -9528,6 +9599,9 @@
         </w:rPr>
       </w:pPr>
       <w:r>
+        <w:rPr>
+          <w:noProof/>
+        </w:rPr>
         <w:drawing>
           <wp:anchor distT="0" distB="0" distL="114300" distR="114300" simplePos="0" relativeHeight="251667456" behindDoc="1" locked="0" layoutInCell="1" allowOverlap="1" wp14:anchorId="4E499102" wp14:editId="115A798F">
             <wp:simplePos x="0" y="0"/>
@@ -9618,270 +9692,300 @@
           <w:sz w:val="20"/>
           <w:szCs w:val="20"/>
         </w:rPr>
-        <w:t xml:space="preserve"> R</w:t>
-      </w:r>
-      <w:r>
+        <w:t xml:space="preserve"> RNF</w:t>
+      </w:r>
+    </w:p>
+    <w:p>
+      <w:pPr>
+        <w:spacing w:after="0"/>
+        <w:jc w:val="both"/>
+        <w:rPr>
+          <w:rFonts w:cstheme="minorHAnsi"/>
+        </w:rPr>
+      </w:pPr>
+    </w:p>
+    <w:p>
+      <w:pPr>
+        <w:spacing w:after="0"/>
+        <w:jc w:val="both"/>
+        <w:rPr>
+          <w:rFonts w:cstheme="minorHAnsi"/>
+        </w:rPr>
+      </w:pPr>
+    </w:p>
+    <w:p>
+      <w:pPr>
+        <w:spacing w:after="0"/>
+        <w:jc w:val="both"/>
+        <w:rPr>
+          <w:rFonts w:cstheme="minorHAnsi"/>
+        </w:rPr>
+      </w:pPr>
+    </w:p>
+    <w:p>
+      <w:pPr>
+        <w:spacing w:after="0"/>
+        <w:jc w:val="both"/>
+        <w:rPr>
+          <w:rFonts w:cstheme="minorHAnsi"/>
+        </w:rPr>
+      </w:pPr>
+    </w:p>
+    <w:p>
+      <w:pPr>
+        <w:spacing w:after="0"/>
+        <w:jc w:val="both"/>
+        <w:rPr>
+          <w:rFonts w:cstheme="minorHAnsi"/>
+        </w:rPr>
+      </w:pPr>
+    </w:p>
+    <w:p>
+      <w:pPr>
+        <w:spacing w:after="0"/>
+        <w:jc w:val="both"/>
+        <w:rPr>
+          <w:rFonts w:cstheme="minorHAnsi"/>
+        </w:rPr>
+      </w:pPr>
+    </w:p>
+    <w:p>
+      <w:pPr>
+        <w:spacing w:after="0"/>
+        <w:jc w:val="both"/>
+        <w:rPr>
+          <w:rFonts w:cstheme="minorHAnsi"/>
+        </w:rPr>
+      </w:pPr>
+    </w:p>
+    <w:p>
+      <w:pPr>
+        <w:spacing w:after="0"/>
+        <w:jc w:val="both"/>
+        <w:rPr>
+          <w:rFonts w:cstheme="minorHAnsi"/>
+        </w:rPr>
+      </w:pPr>
+    </w:p>
+    <w:p>
+      <w:pPr>
+        <w:spacing w:after="0"/>
+        <w:jc w:val="both"/>
+        <w:rPr>
+          <w:rFonts w:cstheme="minorHAnsi"/>
+        </w:rPr>
+      </w:pPr>
+    </w:p>
+    <w:p>
+      <w:pPr>
+        <w:spacing w:after="0"/>
+        <w:jc w:val="both"/>
+        <w:rPr>
+          <w:rFonts w:cstheme="minorHAnsi"/>
+        </w:rPr>
+      </w:pPr>
+    </w:p>
+    <w:p>
+      <w:pPr>
+        <w:spacing w:after="0"/>
+        <w:jc w:val="both"/>
+        <w:rPr>
+          <w:rFonts w:cstheme="minorHAnsi"/>
+        </w:rPr>
+      </w:pPr>
+    </w:p>
+    <w:p>
+      <w:pPr>
+        <w:spacing w:after="0"/>
+        <w:jc w:val="both"/>
+        <w:rPr>
+          <w:rFonts w:cstheme="minorHAnsi"/>
+        </w:rPr>
+      </w:pPr>
+    </w:p>
+    <w:p>
+      <w:pPr>
+        <w:spacing w:after="0"/>
+        <w:jc w:val="both"/>
+        <w:rPr>
+          <w:rFonts w:cstheme="minorHAnsi"/>
+        </w:rPr>
+      </w:pPr>
+    </w:p>
+    <w:p>
+      <w:pPr>
+        <w:spacing w:after="0"/>
+        <w:jc w:val="both"/>
+        <w:rPr>
+          <w:rFonts w:cstheme="minorHAnsi"/>
+        </w:rPr>
+      </w:pPr>
+    </w:p>
+    <w:p>
+      <w:pPr>
+        <w:spacing w:after="0"/>
+        <w:jc w:val="both"/>
+        <w:rPr>
+          <w:rFonts w:cstheme="minorHAnsi"/>
+          <w:b/>
+          <w:bCs/>
+          <w:sz w:val="28"/>
+          <w:szCs w:val="28"/>
+        </w:rPr>
+      </w:pPr>
+    </w:p>
+    <w:p>
+      <w:pPr>
+        <w:spacing w:after="0"/>
+        <w:jc w:val="both"/>
+        <w:rPr>
+          <w:rFonts w:cstheme="minorHAnsi"/>
+          <w:b/>
+          <w:bCs/>
+          <w:sz w:val="28"/>
+          <w:szCs w:val="28"/>
+        </w:rPr>
+      </w:pPr>
+    </w:p>
+    <w:p>
+      <w:pPr>
+        <w:spacing w:after="0"/>
+        <w:jc w:val="both"/>
+        <w:rPr>
+          <w:rFonts w:cstheme="minorHAnsi"/>
+          <w:b/>
+          <w:bCs/>
+          <w:sz w:val="28"/>
+          <w:szCs w:val="28"/>
+        </w:rPr>
+      </w:pPr>
+      <w:r>
+        <w:rPr>
+          <w:rFonts w:cstheme="minorHAnsi"/>
+          <w:b/>
+          <w:bCs/>
+          <w:sz w:val="28"/>
+          <w:szCs w:val="28"/>
+        </w:rPr>
+        <w:lastRenderedPageBreak/>
+        <w:t>3.10.3 Trazabilidad hacia las pruebas</w:t>
+      </w:r>
+    </w:p>
+    <w:p>
+      <w:pPr>
+        <w:spacing w:after="0"/>
+        <w:jc w:val="both"/>
+        <w:rPr>
+          <w:rFonts w:cstheme="minorHAnsi"/>
+        </w:rPr>
+      </w:pPr>
+    </w:p>
+    <w:p>
+      <w:pPr>
+        <w:spacing w:after="0"/>
+        <w:jc w:val="both"/>
+        <w:rPr>
+          <w:rFonts w:cstheme="minorHAnsi"/>
+        </w:rPr>
+      </w:pPr>
+      <w:r>
+        <w:rPr>
+          <w:rFonts w:cstheme="minorHAnsi"/>
+        </w:rPr>
+        <w:t xml:space="preserve">La trazabilidad definida en este capítulo será utilizada posteriormente durante la </w:t>
+      </w:r>
+      <w:r>
+        <w:rPr>
+          <w:rFonts w:cstheme="minorHAnsi"/>
+          <w:b/>
+          <w:bCs/>
+        </w:rPr>
+        <w:t>Fase 5 — Calidad y Pruebas</w:t>
+      </w:r>
+      <w:r>
+        <w:rPr>
+          <w:rFonts w:cstheme="minorHAnsi"/>
+        </w:rPr>
+        <w:t>, donde los requisitos podrán relacionarse con casos de prueba específicos y evidencias de ejecución.</w:t>
+      </w:r>
+    </w:p>
+    <w:p>
+      <w:pPr>
+        <w:spacing w:after="0"/>
+        <w:jc w:val="both"/>
+        <w:rPr>
+          <w:rFonts w:cstheme="minorHAnsi"/>
+        </w:rPr>
+      </w:pPr>
+    </w:p>
+    <w:p>
+      <w:pPr>
+        <w:spacing w:after="0"/>
+        <w:jc w:val="both"/>
         <w:rPr>
           <w:rFonts w:ascii="Arial Black" w:hAnsi="Arial Black" w:cstheme="minorHAnsi"/>
           <w:sz w:val="20"/>
           <w:szCs w:val="20"/>
         </w:rPr>
-        <w:t>N</w:t>
-      </w:r>
+      </w:pPr>
       <w:r>
         <w:rPr>
           <w:rFonts w:ascii="Arial Black" w:hAnsi="Arial Black" w:cstheme="minorHAnsi"/>
           <w:sz w:val="20"/>
           <w:szCs w:val="20"/>
         </w:rPr>
-        <w:t>F</w:t>
-      </w:r>
-    </w:p>
-    <w:p>
-      <w:pPr>
-        <w:spacing w:after="0"/>
-        <w:jc w:val="both"/>
-        <w:rPr>
-          <w:rFonts w:cstheme="minorHAnsi"/>
-        </w:rPr>
-      </w:pPr>
-    </w:p>
-    <w:p>
-      <w:pPr>
-        <w:spacing w:after="0"/>
-        <w:jc w:val="both"/>
-        <w:rPr>
-          <w:rFonts w:cstheme="minorHAnsi"/>
-        </w:rPr>
-      </w:pPr>
-    </w:p>
-    <w:p>
-      <w:pPr>
-        <w:spacing w:after="0"/>
-        <w:jc w:val="both"/>
-        <w:rPr>
-          <w:rFonts w:cstheme="minorHAnsi"/>
-        </w:rPr>
-      </w:pPr>
-    </w:p>
-    <w:p>
-      <w:pPr>
-        <w:spacing w:after="0"/>
-        <w:jc w:val="both"/>
-        <w:rPr>
-          <w:rFonts w:cstheme="minorHAnsi"/>
-        </w:rPr>
-      </w:pPr>
-    </w:p>
-    <w:p>
-      <w:pPr>
-        <w:spacing w:after="0"/>
-        <w:jc w:val="both"/>
-        <w:rPr>
-          <w:rFonts w:cstheme="minorHAnsi"/>
-        </w:rPr>
-      </w:pPr>
-    </w:p>
-    <w:p>
-      <w:pPr>
-        <w:spacing w:after="0"/>
-        <w:jc w:val="both"/>
-        <w:rPr>
-          <w:rFonts w:cstheme="minorHAnsi"/>
-        </w:rPr>
-      </w:pPr>
-    </w:p>
-    <w:p>
-      <w:pPr>
-        <w:spacing w:after="0"/>
-        <w:jc w:val="both"/>
-        <w:rPr>
-          <w:rFonts w:cstheme="minorHAnsi"/>
-        </w:rPr>
-      </w:pPr>
-    </w:p>
-    <w:p>
-      <w:pPr>
-        <w:spacing w:after="0"/>
-        <w:jc w:val="both"/>
-        <w:rPr>
-          <w:rFonts w:cstheme="minorHAnsi"/>
-        </w:rPr>
-      </w:pPr>
-    </w:p>
-    <w:p>
-      <w:pPr>
-        <w:spacing w:after="0"/>
-        <w:jc w:val="both"/>
-        <w:rPr>
-          <w:rFonts w:cstheme="minorHAnsi"/>
-        </w:rPr>
-      </w:pPr>
-    </w:p>
-    <w:p>
-      <w:pPr>
-        <w:spacing w:after="0"/>
-        <w:jc w:val="both"/>
-        <w:rPr>
-          <w:rFonts w:cstheme="minorHAnsi"/>
-        </w:rPr>
-      </w:pPr>
-    </w:p>
-    <w:p>
-      <w:pPr>
-        <w:spacing w:after="0"/>
-        <w:jc w:val="both"/>
-        <w:rPr>
-          <w:rFonts w:cstheme="minorHAnsi"/>
-        </w:rPr>
-      </w:pPr>
-    </w:p>
-    <w:p>
-      <w:pPr>
-        <w:spacing w:after="0"/>
-        <w:jc w:val="both"/>
-        <w:rPr>
-          <w:rFonts w:cstheme="minorHAnsi"/>
-        </w:rPr>
-      </w:pPr>
-    </w:p>
-    <w:p>
-      <w:pPr>
-        <w:spacing w:after="0"/>
-        <w:jc w:val="both"/>
-        <w:rPr>
-          <w:rFonts w:cstheme="minorHAnsi"/>
-        </w:rPr>
-      </w:pPr>
-    </w:p>
-    <w:p>
-      <w:pPr>
-        <w:spacing w:after="0"/>
-        <w:jc w:val="both"/>
-        <w:rPr>
-          <w:rFonts w:cstheme="minorHAnsi"/>
-        </w:rPr>
-      </w:pPr>
-    </w:p>
-    <w:p>
-      <w:pPr>
-        <w:spacing w:after="0"/>
-        <w:jc w:val="both"/>
-        <w:rPr>
-          <w:rFonts w:cstheme="minorHAnsi"/>
-          <w:b/>
-          <w:bCs/>
-          <w:sz w:val="28"/>
-          <w:szCs w:val="28"/>
-        </w:rPr>
-      </w:pPr>
-    </w:p>
-    <w:p>
-      <w:pPr>
-        <w:spacing w:after="0"/>
-        <w:jc w:val="both"/>
-        <w:rPr>
-          <w:rFonts w:cstheme="minorHAnsi"/>
-          <w:b/>
-          <w:bCs/>
-          <w:sz w:val="28"/>
-          <w:szCs w:val="28"/>
-        </w:rPr>
-      </w:pPr>
-    </w:p>
-    <w:p>
-      <w:pPr>
-        <w:spacing w:after="0"/>
-        <w:jc w:val="both"/>
-        <w:rPr>
-          <w:rFonts w:cstheme="minorHAnsi"/>
-          <w:b/>
-          <w:bCs/>
-          <w:sz w:val="28"/>
-          <w:szCs w:val="28"/>
-        </w:rPr>
-      </w:pPr>
-    </w:p>
-    <w:p>
-      <w:pPr>
-        <w:spacing w:after="0"/>
-        <w:jc w:val="both"/>
-        <w:rPr>
-          <w:rFonts w:cstheme="minorHAnsi"/>
-          <w:b/>
-          <w:bCs/>
-          <w:sz w:val="28"/>
-          <w:szCs w:val="28"/>
-        </w:rPr>
-      </w:pPr>
-      <w:r>
-        <w:rPr>
-          <w:rFonts w:cstheme="minorHAnsi"/>
-          <w:b/>
-          <w:bCs/>
-          <w:sz w:val="28"/>
-          <w:szCs w:val="28"/>
-        </w:rPr>
-        <w:lastRenderedPageBreak/>
-        <w:t>3.10.3 Trazabilidad hacia las pruebas</w:t>
-      </w:r>
-    </w:p>
-    <w:p>
-      <w:pPr>
-        <w:spacing w:after="0"/>
-        <w:jc w:val="both"/>
-        <w:rPr>
-          <w:rFonts w:cstheme="minorHAnsi"/>
-        </w:rPr>
-      </w:pPr>
-    </w:p>
-    <w:p>
-      <w:pPr>
-        <w:spacing w:after="0"/>
-        <w:jc w:val="both"/>
-        <w:rPr>
-          <w:rFonts w:cstheme="minorHAnsi"/>
-        </w:rPr>
-      </w:pPr>
-      <w:r>
-        <w:rPr>
-          <w:rFonts w:cstheme="minorHAnsi"/>
-        </w:rPr>
-        <w:t xml:space="preserve">La trazabilidad definida en este capítulo será utilizada posteriormente durante la </w:t>
-      </w:r>
-      <w:r>
-        <w:rPr>
-          <w:rFonts w:cstheme="minorHAnsi"/>
-          <w:b/>
-          <w:bCs/>
-        </w:rPr>
-        <w:t>Fase 5 — Calidad y Pruebas</w:t>
-      </w:r>
-      <w:r>
-        <w:rPr>
-          <w:rFonts w:cstheme="minorHAnsi"/>
-        </w:rPr>
-        <w:t>, donde los requisitos podrán relacionarse con casos de prueba específicos y evidencias de ejecución.</w:t>
-      </w:r>
-    </w:p>
-    <w:p>
-      <w:pPr>
-        <w:spacing w:after="0"/>
-        <w:jc w:val="both"/>
-        <w:rPr>
-          <w:rFonts w:cstheme="minorHAnsi"/>
-        </w:rPr>
-      </w:pPr>
-    </w:p>
-    <w:p>
-      <w:pPr>
-        <w:spacing w:after="0"/>
-        <w:jc w:val="both"/>
+        <w:t>Figura 3.</w:t>
+      </w:r>
+      <w:r>
         <w:rPr>
           <w:rFonts w:ascii="Arial Black" w:hAnsi="Arial Black" w:cstheme="minorHAnsi"/>
           <w:sz w:val="20"/>
           <w:szCs w:val="20"/>
         </w:rPr>
+        <w:t>2</w:t>
+      </w:r>
+      <w:r>
+        <w:rPr>
+          <w:rFonts w:ascii="Arial Black" w:hAnsi="Arial Black" w:cstheme="minorHAnsi"/>
+          <w:sz w:val="20"/>
+          <w:szCs w:val="20"/>
+        </w:rPr>
+        <w:t xml:space="preserve"> </w:t>
+      </w:r>
+      <w:r>
+        <w:rPr>
+          <w:rFonts w:ascii="Arial Black" w:hAnsi="Arial Black" w:cstheme="minorHAnsi"/>
+          <w:sz w:val="20"/>
+          <w:szCs w:val="20"/>
+        </w:rPr>
+        <w:t>Trazabilidad</w:t>
+      </w:r>
+      <w:r>
+        <w:rPr>
+          <w:rFonts w:ascii="Arial Black" w:hAnsi="Arial Black" w:cstheme="minorHAnsi"/>
+          <w:sz w:val="20"/>
+          <w:szCs w:val="20"/>
+        </w:rPr>
+        <w:t xml:space="preserve"> </w:t>
+      </w:r>
+      <w:r>
+        <w:rPr>
+          <w:rFonts w:ascii="Arial Black" w:hAnsi="Arial Black" w:cstheme="minorHAnsi"/>
+          <w:sz w:val="20"/>
+          <w:szCs w:val="20"/>
+        </w:rPr>
+        <w:t xml:space="preserve">hacia casos de pruebas y ejecución </w:t>
+      </w:r>
+    </w:p>
+    <w:p>
+      <w:pPr>
+        <w:spacing w:after="0"/>
+        <w:jc w:val="both"/>
+        <w:rPr>
+          <w:rFonts w:ascii="Arial Black" w:hAnsi="Arial Black" w:cstheme="minorHAnsi"/>
+          <w:sz w:val="20"/>
+          <w:szCs w:val="20"/>
+        </w:rPr>
       </w:pPr>
       <w:r>
         <w:rPr>
@@ -9889,13 +9993,13 @@
           <w:noProof/>
         </w:rPr>
         <w:drawing>
-          <wp:anchor distT="0" distB="0" distL="114300" distR="114300" simplePos="0" relativeHeight="251668480" behindDoc="1" locked="0" layoutInCell="1" allowOverlap="1" wp14:anchorId="3A3E0F86" wp14:editId="24DB3677">
+          <wp:anchor distT="0" distB="0" distL="114300" distR="114300" simplePos="0" relativeHeight="251668480" behindDoc="1" locked="0" layoutInCell="1" allowOverlap="1" wp14:anchorId="3A3E0F86" wp14:editId="377C1E6C">
             <wp:simplePos x="0" y="0"/>
             <wp:positionH relativeFrom="column">
               <wp:posOffset>-3810</wp:posOffset>
             </wp:positionH>
             <wp:positionV relativeFrom="paragraph">
-              <wp:posOffset>173355</wp:posOffset>
+              <wp:posOffset>56515</wp:posOffset>
             </wp:positionV>
             <wp:extent cx="5612130" cy="3158490"/>
             <wp:effectExtent l="0" t="0" r="7620" b="3810"/>
@@ -9938,65 +10042,6 @@
           </wp:anchor>
         </w:drawing>
       </w:r>
-      <w:r>
-        <w:rPr>
-          <w:rFonts w:ascii="Arial Black" w:hAnsi="Arial Black" w:cstheme="minorHAnsi"/>
-          <w:sz w:val="20"/>
-          <w:szCs w:val="20"/>
-        </w:rPr>
-        <w:t>Figura 3.</w:t>
-      </w:r>
-      <w:r>
-        <w:rPr>
-          <w:rFonts w:ascii="Arial Black" w:hAnsi="Arial Black" w:cstheme="minorHAnsi"/>
-          <w:sz w:val="20"/>
-          <w:szCs w:val="20"/>
-        </w:rPr>
-        <w:t>2</w:t>
-      </w:r>
-      <w:r>
-        <w:rPr>
-          <w:rFonts w:ascii="Arial Black" w:hAnsi="Arial Black" w:cstheme="minorHAnsi"/>
-          <w:sz w:val="20"/>
-          <w:szCs w:val="20"/>
-        </w:rPr>
-        <w:t xml:space="preserve"> </w:t>
-      </w:r>
-      <w:r>
-        <w:rPr>
-          <w:rFonts w:ascii="Arial Black" w:hAnsi="Arial Black" w:cstheme="minorHAnsi"/>
-          <w:sz w:val="20"/>
-          <w:szCs w:val="20"/>
-        </w:rPr>
-        <w:t>Trazabilidad</w:t>
-      </w:r>
-      <w:r>
-        <w:rPr>
-          <w:rFonts w:ascii="Arial Black" w:hAnsi="Arial Black" w:cstheme="minorHAnsi"/>
-          <w:sz w:val="20"/>
-          <w:szCs w:val="20"/>
-        </w:rPr>
-        <w:t xml:space="preserve"> </w:t>
-      </w:r>
-      <w:r>
-        <w:rPr>
-          <w:rFonts w:ascii="Arial Black" w:hAnsi="Arial Black" w:cstheme="minorHAnsi"/>
-          <w:sz w:val="20"/>
-          <w:szCs w:val="20"/>
-        </w:rPr>
-        <w:t xml:space="preserve">hacia casos de pruebas y ejecución </w:t>
-      </w:r>
-    </w:p>
-    <w:p>
-      <w:pPr>
-        <w:spacing w:after="0"/>
-        <w:jc w:val="both"/>
-        <w:rPr>
-          <w:rFonts w:ascii="Arial Black" w:hAnsi="Arial Black" w:cstheme="minorHAnsi"/>
-          <w:sz w:val="20"/>
-          <w:szCs w:val="20"/>
-        </w:rPr>
-      </w:pPr>
     </w:p>
     <w:p>
       <w:pPr>
@@ -10307,7 +10352,7 @@
         <v:path o:extrusionok="f" gradientshapeok="t" o:connecttype="rect"/>
         <o:lock v:ext="edit" aspectratio="t"/>
       </v:shapetype>
-      <v:shape id="_x0000_i1316" type="#_x0000_t75" style="width:11.25pt;height:11.25pt" o:bullet="t">
+      <v:shape id="_x0000_i5285" type="#_x0000_t75" style="width:11.25pt;height:11.25pt" o:bullet="t">
         <v:imagedata r:id="rId1" o:title="msoF7E2"/>
       </v:shape>
     </w:pict>
@@ -13761,6 +13806,7 @@
   <w:style w:type="character" w:default="1" w:styleId="Fuentedeprrafopredeter">
     <w:name w:val="Default Paragraph Font"/>
     <w:uiPriority w:val="1"/>
+    <w:semiHidden/>
     <w:unhideWhenUsed/>
   </w:style>
   <w:style w:type="table" w:default="1" w:styleId="Tablanormal">

</xml_diff>